<commit_message>
fix: update website before GitHub Pages deployment
</commit_message>
<xml_diff>
--- a/Laporan Outstanding.docx
+++ b/Laporan Outstanding.docx
@@ -2,6 +2,1760 @@
 <file path=word/document.xml><?xml version="1.0" encoding="utf-8"?>
 <w:document xmlns:wpc="http://schemas.microsoft.com/office/word/2010/wordprocessingCanvas" xmlns:cx="http://schemas.microsoft.com/office/drawing/2014/chartex" xmlns:cx1="http://schemas.microsoft.com/office/drawing/2015/9/8/chartex" xmlns:cx2="http://schemas.microsoft.com/office/drawing/2015/10/21/chartex" xmlns:cx3="http://schemas.microsoft.com/office/drawing/2016/5/9/chartex" xmlns:cx4="http://schemas.microsoft.com/office/drawing/2016/5/10/chartex" xmlns:cx5="http://schemas.microsoft.com/office/drawing/2016/5/11/chartex" xmlns:cx6="http://schemas.microsoft.com/office/drawing/2016/5/12/chartex" xmlns:cx7="http://schemas.microsoft.com/office/drawing/2016/5/13/chartex" xmlns:cx8="http://schemas.microsoft.com/office/drawing/2016/5/14/chartex" xmlns:mc="http://schemas.openxmlformats.org/markup-compatibility/2006" xmlns:aink="http://schemas.microsoft.com/office/drawing/2016/ink" xmlns:am3d="http://schemas.microsoft.com/office/drawing/2017/model3d" xmlns:o="urn:schemas-microsoft-com:office:office" xmlns:oel="http://schemas.microsoft.com/office/2019/extlst" xmlns:r="http://schemas.openxmlformats.org/officeDocument/2006/relationships" xmlns:m="http://schemas.openxmlformats.org/officeDocument/2006/math" xmlns:v="urn:schemas-microsoft-com:vml" xmlns:wp14="http://schemas.microsoft.com/office/word/2010/wordprocessingDrawing" xmlns:wp="http://schemas.openxmlformats.org/drawingml/2006/wordprocessingDrawing" xmlns:w10="urn:schemas-microsoft-com:office:word" xmlns:w="http://schemas.openxmlformats.org/wordprocessingml/2006/main" xmlns:w14="http://schemas.microsoft.com/office/word/2010/wordml" xmlns:w15="http://schemas.microsoft.com/office/word/2012/wordml" xmlns:w16cex="http://schemas.microsoft.com/office/word/2018/wordml/cex" xmlns:w16cid="http://schemas.microsoft.com/office/word/2016/wordml/cid" xmlns:w16="http://schemas.microsoft.com/office/word/2018/wordml" xmlns:w16du="http://schemas.microsoft.com/office/word/2023/wordml/word16du" xmlns:w16sdtdh="http://schemas.microsoft.com/office/word/2020/wordml/sdtdatahash" xmlns:w16sdtfl="http://schemas.microsoft.com/office/word/2024/wordml/sdtformatlock" xmlns:w16se="http://schemas.microsoft.com/office/word/2015/wordml/symex" xmlns:wpg="http://schemas.microsoft.com/office/word/2010/wordprocessingGroup" xmlns:wpi="http://schemas.microsoft.com/office/word/2010/wordprocessingInk" xmlns:wne="http://schemas.microsoft.com/office/word/2006/wordml" xmlns:wps="http://schemas.microsoft.com/office/word/2010/wordprocessingShape" mc:Ignorable="w14 w15 w16se w16cid w16 w16cex w16sdtdh w16sdtfl w16du wp14">
   <w:body>
+    <w:p>
+      <w:r>
+        <w:t xml:space="preserve">Berikut </w:t>
+      </w:r>
+      <w:r>
+        <w:rPr>
+          <w:b/>
+          <w:bCs/>
+        </w:rPr>
+        <w:t>Laporan Update Pekerjaan Terakhir</w:t>
+      </w:r>
+      <w:r>
+        <w:t xml:space="preserve"> untuk proyek </w:t>
+      </w:r>
+      <w:r>
+        <w:rPr>
+          <w:b/>
+          <w:bCs/>
+        </w:rPr>
+        <w:t>Website Polda Papua Tengah</w:t>
+      </w:r>
+      <w:r>
+        <w:t>.</w:t>
+      </w:r>
+    </w:p>
+    <w:p>
+      <w:r>
+        <w:pict w14:anchorId="2DDFF47E">
+          <v:rect id="_x0000_i1123" style="width:0;height:1.5pt" o:hralign="center" o:hrstd="t" o:hr="t" fillcolor="#a0a0a0" stroked="f"/>
+        </w:pict>
+      </w:r>
+    </w:p>
+    <w:p>
+      <w:pPr>
+        <w:rPr>
+          <w:b/>
+          <w:bCs/>
+        </w:rPr>
+      </w:pPr>
+      <w:r>
+        <w:rPr>
+          <w:b/>
+          <w:bCs/>
+        </w:rPr>
+        <w:t>Laporan Progress Pekerjaan</w:t>
+      </w:r>
+    </w:p>
+    <w:p>
+      <w:r>
+        <w:rPr>
+          <w:b/>
+          <w:bCs/>
+        </w:rPr>
+        <w:t>Tanggal:</w:t>
+      </w:r>
+      <w:r>
+        <w:t xml:space="preserve"> 08 Juli 2026</w:t>
+      </w:r>
+    </w:p>
+    <w:p>
+      <w:pPr>
+        <w:rPr>
+          <w:b/>
+          <w:bCs/>
+        </w:rPr>
+      </w:pPr>
+      <w:r>
+        <w:rPr>
+          <w:b/>
+          <w:bCs/>
+        </w:rPr>
+        <w:t>Project</w:t>
+      </w:r>
+    </w:p>
+    <w:p>
+      <w:r>
+        <w:rPr>
+          <w:b/>
+          <w:bCs/>
+        </w:rPr>
+        <w:t>Website Resmi Polda Papua Tengah</w:t>
+      </w:r>
+    </w:p>
+    <w:p>
+      <w:r>
+        <w:pict w14:anchorId="03B35BF2">
+          <v:rect id="_x0000_i1124" style="width:0;height:1.5pt" o:hralign="center" o:hrstd="t" o:hr="t" fillcolor="#a0a0a0" stroked="f"/>
+        </w:pict>
+      </w:r>
+    </w:p>
+    <w:p>
+      <w:pPr>
+        <w:rPr>
+          <w:b/>
+          <w:bCs/>
+        </w:rPr>
+      </w:pPr>
+      <w:r>
+        <w:rPr>
+          <w:rFonts w:ascii="Segoe UI Emoji" w:hAnsi="Segoe UI Emoji" w:cs="Segoe UI Emoji"/>
+          <w:b/>
+          <w:bCs/>
+        </w:rPr>
+        <w:t>✅</w:t>
+      </w:r>
+      <w:r>
+        <w:rPr>
+          <w:b/>
+          <w:bCs/>
+        </w:rPr>
+        <w:t xml:space="preserve"> Progress yang telah diselesaikan</w:t>
+      </w:r>
+    </w:p>
+    <w:p>
+      <w:pPr>
+        <w:rPr>
+          <w:b/>
+          <w:bCs/>
+        </w:rPr>
+      </w:pPr>
+      <w:r>
+        <w:rPr>
+          <w:b/>
+          <w:bCs/>
+        </w:rPr>
+        <w:t>1. Infrastruktur Project</w:t>
+      </w:r>
+    </w:p>
+    <w:p>
+      <w:pPr>
+        <w:numPr>
+          <w:ilvl w:val="0"/>
+          <w:numId w:val="8"/>
+        </w:numPr>
+      </w:pPr>
+      <w:r>
+        <w:rPr>
+          <w:rFonts w:ascii="Segoe UI Symbol" w:hAnsi="Segoe UI Symbol" w:cs="Segoe UI Symbol"/>
+        </w:rPr>
+        <w:t>✔</w:t>
+      </w:r>
+      <w:r>
+        <w:t xml:space="preserve"> Instalasi Node.js dan npm selesai.</w:t>
+      </w:r>
+    </w:p>
+    <w:p>
+      <w:pPr>
+        <w:numPr>
+          <w:ilvl w:val="0"/>
+          <w:numId w:val="8"/>
+        </w:numPr>
+      </w:pPr>
+      <w:r>
+        <w:rPr>
+          <w:rFonts w:ascii="Segoe UI Symbol" w:hAnsi="Segoe UI Symbol" w:cs="Segoe UI Symbol"/>
+        </w:rPr>
+        <w:t>✔</w:t>
+      </w:r>
+      <w:r>
+        <w:t xml:space="preserve"> Project React + Vite berhasil dibuat.</w:t>
+      </w:r>
+    </w:p>
+    <w:p>
+      <w:pPr>
+        <w:numPr>
+          <w:ilvl w:val="0"/>
+          <w:numId w:val="8"/>
+        </w:numPr>
+      </w:pPr>
+      <w:r>
+        <w:rPr>
+          <w:rFonts w:ascii="Segoe UI Symbol" w:hAnsi="Segoe UI Symbol" w:cs="Segoe UI Symbol"/>
+        </w:rPr>
+        <w:t>✔</w:t>
+      </w:r>
+      <w:r>
+        <w:t xml:space="preserve"> Struktur folder project mulai dirapikan.</w:t>
+      </w:r>
+    </w:p>
+    <w:p>
+      <w:pPr>
+        <w:numPr>
+          <w:ilvl w:val="0"/>
+          <w:numId w:val="8"/>
+        </w:numPr>
+      </w:pPr>
+      <w:r>
+        <w:rPr>
+          <w:rFonts w:ascii="Segoe UI Symbol" w:hAnsi="Segoe UI Symbol" w:cs="Segoe UI Symbol"/>
+        </w:rPr>
+        <w:t>✔</w:t>
+      </w:r>
+      <w:r>
+        <w:t xml:space="preserve"> Repository GitHub berhasil dibuat.</w:t>
+      </w:r>
+    </w:p>
+    <w:p>
+      <w:pPr>
+        <w:numPr>
+          <w:ilvl w:val="0"/>
+          <w:numId w:val="8"/>
+        </w:numPr>
+      </w:pPr>
+      <w:r>
+        <w:rPr>
+          <w:rFonts w:ascii="Segoe UI Symbol" w:hAnsi="Segoe UI Symbol" w:cs="Segoe UI Symbol"/>
+        </w:rPr>
+        <w:t>✔</w:t>
+      </w:r>
+      <w:r>
+        <w:t xml:space="preserve"> Source code berhasil dipush ke GitHub.</w:t>
+      </w:r>
+    </w:p>
+    <w:p>
+      <w:pPr>
+        <w:numPr>
+          <w:ilvl w:val="0"/>
+          <w:numId w:val="8"/>
+        </w:numPr>
+      </w:pPr>
+      <w:r>
+        <w:rPr>
+          <w:rFonts w:ascii="Segoe UI Symbol" w:hAnsi="Segoe UI Symbol" w:cs="Segoe UI Symbol"/>
+        </w:rPr>
+        <w:t>✔</w:t>
+      </w:r>
+      <w:r>
+        <w:t xml:space="preserve"> GitHub Project berhasil dibuat sebagai manajemen proyek.</w:t>
+      </w:r>
+    </w:p>
+    <w:p>
+      <w:r>
+        <w:pict w14:anchorId="12DB020C">
+          <v:rect id="_x0000_i1125" style="width:0;height:1.5pt" o:hralign="center" o:hrstd="t" o:hr="t" fillcolor="#a0a0a0" stroked="f"/>
+        </w:pict>
+      </w:r>
+    </w:p>
+    <w:p>
+      <w:pPr>
+        <w:rPr>
+          <w:b/>
+          <w:bCs/>
+        </w:rPr>
+      </w:pPr>
+      <w:r>
+        <w:rPr>
+          <w:b/>
+          <w:bCs/>
+        </w:rPr>
+        <w:t>2. Hero Section</w:t>
+      </w:r>
+    </w:p>
+    <w:p>
+      <w:pPr>
+        <w:numPr>
+          <w:ilvl w:val="0"/>
+          <w:numId w:val="9"/>
+        </w:numPr>
+      </w:pPr>
+      <w:r>
+        <w:rPr>
+          <w:rFonts w:ascii="Segoe UI Symbol" w:hAnsi="Segoe UI Symbol" w:cs="Segoe UI Symbol"/>
+        </w:rPr>
+        <w:t>✔</w:t>
+      </w:r>
+      <w:r>
+        <w:t xml:space="preserve"> Hero menggunakan desain full image.</w:t>
+      </w:r>
+    </w:p>
+    <w:p>
+      <w:pPr>
+        <w:numPr>
+          <w:ilvl w:val="0"/>
+          <w:numId w:val="9"/>
+        </w:numPr>
+      </w:pPr>
+      <w:r>
+        <w:rPr>
+          <w:rFonts w:ascii="Segoe UI Symbol" w:hAnsi="Segoe UI Symbol" w:cs="Segoe UI Symbol"/>
+        </w:rPr>
+        <w:t>✔</w:t>
+      </w:r>
+      <w:r>
+        <w:t xml:space="preserve"> Tombol </w:t>
+      </w:r>
+      <w:r>
+        <w:rPr>
+          <w:b/>
+          <w:bCs/>
+        </w:rPr>
+        <w:t>Selengkapnya</w:t>
+      </w:r>
+      <w:r>
+        <w:t xml:space="preserve"> berhasil dibuat menggunakan posisi absolute.</w:t>
+      </w:r>
+    </w:p>
+    <w:p>
+      <w:pPr>
+        <w:numPr>
+          <w:ilvl w:val="0"/>
+          <w:numId w:val="9"/>
+        </w:numPr>
+      </w:pPr>
+      <w:r>
+        <w:rPr>
+          <w:rFonts w:ascii="Segoe UI Symbol" w:hAnsi="Segoe UI Symbol" w:cs="Segoe UI Symbol"/>
+        </w:rPr>
+        <w:t>✔</w:t>
+      </w:r>
+      <w:r>
+        <w:t xml:space="preserve"> Posisi tombol disesuaikan agar berada di area transisi Hero dan Footer.</w:t>
+      </w:r>
+    </w:p>
+    <w:p>
+      <w:pPr>
+        <w:numPr>
+          <w:ilvl w:val="0"/>
+          <w:numId w:val="9"/>
+        </w:numPr>
+      </w:pPr>
+      <w:r>
+        <w:rPr>
+          <w:rFonts w:ascii="Segoe UI Symbol" w:hAnsi="Segoe UI Symbol" w:cs="Segoe UI Symbol"/>
+        </w:rPr>
+        <w:t>✔</w:t>
+      </w:r>
+      <w:r>
+        <w:t xml:space="preserve"> Background gambar Kapolda telah diperbaiki (transparan).</w:t>
+      </w:r>
+    </w:p>
+    <w:p>
+      <w:pPr>
+        <w:numPr>
+          <w:ilvl w:val="0"/>
+          <w:numId w:val="9"/>
+        </w:numPr>
+      </w:pPr>
+      <w:r>
+        <w:rPr>
+          <w:rFonts w:ascii="Segoe UI Symbol" w:hAnsi="Segoe UI Symbol" w:cs="Segoe UI Symbol"/>
+        </w:rPr>
+        <w:t>✔</w:t>
+      </w:r>
+      <w:r>
+        <w:t xml:space="preserve"> Hero dibuat responsif terhadap perubahan resolusi.</w:t>
+      </w:r>
+    </w:p>
+    <w:p>
+      <w:r>
+        <w:pict w14:anchorId="76EA437F">
+          <v:rect id="_x0000_i1126" style="width:0;height:1.5pt" o:hralign="center" o:hrstd="t" o:hr="t" fillcolor="#a0a0a0" stroked="f"/>
+        </w:pict>
+      </w:r>
+    </w:p>
+    <w:p>
+      <w:pPr>
+        <w:rPr>
+          <w:b/>
+          <w:bCs/>
+        </w:rPr>
+      </w:pPr>
+      <w:r>
+        <w:rPr>
+          <w:b/>
+          <w:bCs/>
+        </w:rPr>
+        <w:t>3. Header</w:t>
+      </w:r>
+    </w:p>
+    <w:p>
+      <w:pPr>
+        <w:numPr>
+          <w:ilvl w:val="0"/>
+          <w:numId w:val="10"/>
+        </w:numPr>
+      </w:pPr>
+      <w:r>
+        <w:rPr>
+          <w:rFonts w:ascii="Segoe UI Symbol" w:hAnsi="Segoe UI Symbol" w:cs="Segoe UI Symbol"/>
+        </w:rPr>
+        <w:t>✔</w:t>
+      </w:r>
+      <w:r>
+        <w:t xml:space="preserve"> Header dibuat menggunakan position: fixed.</w:t>
+      </w:r>
+    </w:p>
+    <w:p>
+      <w:pPr>
+        <w:numPr>
+          <w:ilvl w:val="0"/>
+          <w:numId w:val="10"/>
+        </w:numPr>
+      </w:pPr>
+      <w:r>
+        <w:rPr>
+          <w:rFonts w:ascii="Segoe UI Symbol" w:hAnsi="Segoe UI Symbol" w:cs="Segoe UI Symbol"/>
+        </w:rPr>
+        <w:t>✔</w:t>
+      </w:r>
+      <w:r>
+        <w:t xml:space="preserve"> Header berhasil dibuat dapat </w:t>
+      </w:r>
+      <w:r>
+        <w:rPr>
+          <w:b/>
+          <w:bCs/>
+        </w:rPr>
+        <w:t>auto dropdown</w:t>
+      </w:r>
+      <w:r>
+        <w:t xml:space="preserve"> saat diarahkan mouse (hover).</w:t>
+      </w:r>
+    </w:p>
+    <w:p>
+      <w:pPr>
+        <w:numPr>
+          <w:ilvl w:val="0"/>
+          <w:numId w:val="10"/>
+        </w:numPr>
+      </w:pPr>
+      <w:r>
+        <w:rPr>
+          <w:rFonts w:ascii="Segoe UI Symbol" w:hAnsi="Segoe UI Symbol" w:cs="Segoe UI Symbol"/>
+        </w:rPr>
+        <w:t>✔</w:t>
+      </w:r>
+      <w:r>
+        <w:t xml:space="preserve"> Tombol </w:t>
+      </w:r>
+      <w:r>
+        <w:rPr>
+          <w:rFonts w:ascii="Arial" w:hAnsi="Arial" w:cs="Arial"/>
+          <w:b/>
+          <w:bCs/>
+        </w:rPr>
+        <w:t>▼</w:t>
+      </w:r>
+      <w:r>
+        <w:rPr>
+          <w:b/>
+          <w:bCs/>
+        </w:rPr>
+        <w:t xml:space="preserve"> MENU</w:t>
+      </w:r>
+      <w:r>
+        <w:t xml:space="preserve"> berhasil ditambahkan sebagai trigger.</w:t>
+      </w:r>
+    </w:p>
+    <w:p>
+      <w:pPr>
+        <w:numPr>
+          <w:ilvl w:val="0"/>
+          <w:numId w:val="10"/>
+        </w:numPr>
+      </w:pPr>
+      <w:r>
+        <w:rPr>
+          <w:rFonts w:ascii="Segoe UI Symbol" w:hAnsi="Segoe UI Symbol" w:cs="Segoe UI Symbol"/>
+        </w:rPr>
+        <w:t>✔</w:t>
+      </w:r>
+      <w:r>
+        <w:t xml:space="preserve"> Struktur Header dipisahkan menjadi component React.</w:t>
+      </w:r>
+    </w:p>
+    <w:p>
+      <w:r>
+        <w:pict w14:anchorId="142C67BC">
+          <v:rect id="_x0000_i1127" style="width:0;height:1.5pt" o:hralign="center" o:hrstd="t" o:hr="t" fillcolor="#a0a0a0" stroked="f"/>
+        </w:pict>
+      </w:r>
+    </w:p>
+    <w:p>
+      <w:pPr>
+        <w:rPr>
+          <w:b/>
+          <w:bCs/>
+        </w:rPr>
+      </w:pPr>
+      <w:r>
+        <w:rPr>
+          <w:b/>
+          <w:bCs/>
+        </w:rPr>
+        <w:t>4. Footer</w:t>
+      </w:r>
+    </w:p>
+    <w:p>
+      <w:pPr>
+        <w:numPr>
+          <w:ilvl w:val="0"/>
+          <w:numId w:val="11"/>
+        </w:numPr>
+      </w:pPr>
+      <w:r>
+        <w:rPr>
+          <w:rFonts w:ascii="Segoe UI Symbol" w:hAnsi="Segoe UI Symbol" w:cs="Segoe UI Symbol"/>
+        </w:rPr>
+        <w:lastRenderedPageBreak/>
+        <w:t>✔</w:t>
+      </w:r>
+      <w:r>
+        <w:t xml:space="preserve"> Footer dibuat dengan identitas resmi Polda Papua Tengah.</w:t>
+      </w:r>
+    </w:p>
+    <w:p>
+      <w:pPr>
+        <w:numPr>
+          <w:ilvl w:val="0"/>
+          <w:numId w:val="11"/>
+        </w:numPr>
+      </w:pPr>
+      <w:r>
+        <w:rPr>
+          <w:rFonts w:ascii="Segoe UI Symbol" w:hAnsi="Segoe UI Symbol" w:cs="Segoe UI Symbol"/>
+        </w:rPr>
+        <w:t>✔</w:t>
+      </w:r>
+      <w:r>
+        <w:t xml:space="preserve"> Padding footer disesuaikan agar lebih proporsional.</w:t>
+      </w:r>
+    </w:p>
+    <w:p>
+      <w:pPr>
+        <w:numPr>
+          <w:ilvl w:val="0"/>
+          <w:numId w:val="11"/>
+        </w:numPr>
+      </w:pPr>
+      <w:r>
+        <w:rPr>
+          <w:rFonts w:ascii="Segoe UI Symbol" w:hAnsi="Segoe UI Symbol" w:cs="Segoe UI Symbol"/>
+        </w:rPr>
+        <w:t>✔</w:t>
+      </w:r>
+      <w:r>
+        <w:t xml:space="preserve"> Informasi alamat berhasil ditambahkan.</w:t>
+      </w:r>
+    </w:p>
+    <w:p>
+      <w:r>
+        <w:pict w14:anchorId="06944FDF">
+          <v:rect id="_x0000_i1128" style="width:0;height:1.5pt" o:hralign="center" o:hrstd="t" o:hr="t" fillcolor="#a0a0a0" stroked="f"/>
+        </w:pict>
+      </w:r>
+    </w:p>
+    <w:p>
+      <w:pPr>
+        <w:rPr>
+          <w:b/>
+          <w:bCs/>
+        </w:rPr>
+      </w:pPr>
+      <w:r>
+        <w:rPr>
+          <w:b/>
+          <w:bCs/>
+        </w:rPr>
+        <w:t>5. Perbaikan Layout</w:t>
+      </w:r>
+    </w:p>
+    <w:p>
+      <w:pPr>
+        <w:numPr>
+          <w:ilvl w:val="0"/>
+          <w:numId w:val="12"/>
+        </w:numPr>
+      </w:pPr>
+      <w:r>
+        <w:rPr>
+          <w:rFonts w:ascii="Segoe UI Symbol" w:hAnsi="Segoe UI Symbol" w:cs="Segoe UI Symbol"/>
+        </w:rPr>
+        <w:t>✔</w:t>
+      </w:r>
+      <w:r>
+        <w:t xml:space="preserve"> Konflik CSS antara App.css dan Hero.css berhasil ditemukan.</w:t>
+      </w:r>
+    </w:p>
+    <w:p>
+      <w:pPr>
+        <w:numPr>
+          <w:ilvl w:val="0"/>
+          <w:numId w:val="12"/>
+        </w:numPr>
+      </w:pPr>
+      <w:r>
+        <w:rPr>
+          <w:rFonts w:ascii="Segoe UI Symbol" w:hAnsi="Segoe UI Symbol" w:cs="Segoe UI Symbol"/>
+        </w:rPr>
+        <w:t>✔</w:t>
+      </w:r>
+      <w:r>
+        <w:t xml:space="preserve"> CSS Hero lama yang sudah tidak digunakan berhasil diidentifikasi.</w:t>
+      </w:r>
+    </w:p>
+    <w:p>
+      <w:pPr>
+        <w:numPr>
+          <w:ilvl w:val="0"/>
+          <w:numId w:val="12"/>
+        </w:numPr>
+      </w:pPr>
+      <w:r>
+        <w:rPr>
+          <w:rFonts w:ascii="Segoe UI Symbol" w:hAnsi="Segoe UI Symbol" w:cs="Segoe UI Symbol"/>
+        </w:rPr>
+        <w:t>✔</w:t>
+      </w:r>
+      <w:r>
+        <w:t xml:space="preserve"> Analisis penyebab Hero bergeser telah dilakukan.</w:t>
+      </w:r>
+    </w:p>
+    <w:p>
+      <w:pPr>
+        <w:numPr>
+          <w:ilvl w:val="0"/>
+          <w:numId w:val="12"/>
+        </w:numPr>
+      </w:pPr>
+      <w:r>
+        <w:rPr>
+          <w:rFonts w:ascii="Segoe UI Symbol" w:hAnsi="Segoe UI Symbol" w:cs="Segoe UI Symbol"/>
+        </w:rPr>
+        <w:t>✔</w:t>
+      </w:r>
+      <w:r>
+        <w:t xml:space="preserve"> Analisis ruang kosong antara Hero dan Footer telah dilakukan.</w:t>
+      </w:r>
+    </w:p>
+    <w:p>
+      <w:r>
+        <w:pict w14:anchorId="02C8D6D0">
+          <v:rect id="_x0000_i1129" style="width:0;height:1.5pt" o:hralign="center" o:hrstd="t" o:hr="t" fillcolor="#a0a0a0" stroked="f"/>
+        </w:pict>
+      </w:r>
+    </w:p>
+    <w:p>
+      <w:pPr>
+        <w:rPr>
+          <w:b/>
+          <w:bCs/>
+        </w:rPr>
+      </w:pPr>
+      <w:r>
+        <w:rPr>
+          <w:b/>
+          <w:bCs/>
+        </w:rPr>
+        <w:t>6. Persiapan Animasi</w:t>
+      </w:r>
+    </w:p>
+    <w:p>
+      <w:pPr>
+        <w:numPr>
+          <w:ilvl w:val="0"/>
+          <w:numId w:val="13"/>
+        </w:numPr>
+      </w:pPr>
+      <w:r>
+        <w:rPr>
+          <w:rFonts w:ascii="Segoe UI Symbol" w:hAnsi="Segoe UI Symbol" w:cs="Segoe UI Symbol"/>
+        </w:rPr>
+        <w:t>✔</w:t>
+      </w:r>
+      <w:r>
+        <w:t xml:space="preserve"> Library </w:t>
+      </w:r>
+      <w:r>
+        <w:rPr>
+          <w:b/>
+          <w:bCs/>
+        </w:rPr>
+        <w:t>GSAP (GreenSock Animation Platform)</w:t>
+      </w:r>
+      <w:r>
+        <w:t xml:space="preserve"> berhasil diinstal.</w:t>
+      </w:r>
+    </w:p>
+    <w:p>
+      <w:r>
+        <w:t>npm install gsap</w:t>
+      </w:r>
+    </w:p>
+    <w:p>
+      <w:r>
+        <w:t>Status:</w:t>
+      </w:r>
+    </w:p>
+    <w:p>
+      <w:r>
+        <w:t>added 1 package</w:t>
+      </w:r>
+    </w:p>
+    <w:p>
+      <w:r>
+        <w:t>found 0 vulnerabilities</w:t>
+      </w:r>
+    </w:p>
+    <w:p>
+      <w:r>
+        <w:t>GSAP siap digunakan.</w:t>
+      </w:r>
+    </w:p>
+    <w:p>
+      <w:r>
+        <w:pict w14:anchorId="6DE590E6">
+          <v:rect id="_x0000_i1130" style="width:0;height:1.5pt" o:hralign="center" o:hrstd="t" o:hr="t" fillcolor="#a0a0a0" stroked="f"/>
+        </w:pict>
+      </w:r>
+    </w:p>
+    <w:p>
+      <w:pPr>
+        <w:rPr>
+          <w:b/>
+          <w:bCs/>
+        </w:rPr>
+      </w:pPr>
+      <w:r>
+        <w:rPr>
+          <w:rFonts w:ascii="Segoe UI Emoji" w:hAnsi="Segoe UI Emoji" w:cs="Segoe UI Emoji"/>
+          <w:b/>
+          <w:bCs/>
+        </w:rPr>
+        <w:t>🔄</w:t>
+      </w:r>
+      <w:r>
+        <w:rPr>
+          <w:b/>
+          <w:bCs/>
+        </w:rPr>
+        <w:t xml:space="preserve"> Sedang Dikerjakan</w:t>
+      </w:r>
+    </w:p>
+    <w:p>
+      <w:pPr>
+        <w:rPr>
+          <w:b/>
+          <w:bCs/>
+        </w:rPr>
+      </w:pPr>
+      <w:r>
+        <w:rPr>
+          <w:b/>
+          <w:bCs/>
+        </w:rPr>
+        <w:t>Refactor Header menggunakan GSAP</w:t>
+      </w:r>
+    </w:p>
+    <w:p>
+      <w:r>
+        <w:t>Tahap yang sedang berlangsung:</w:t>
+      </w:r>
+    </w:p>
+    <w:p>
+      <w:pPr>
+        <w:numPr>
+          <w:ilvl w:val="0"/>
+          <w:numId w:val="14"/>
+        </w:numPr>
+      </w:pPr>
+      <w:r>
+        <w:t>Membuat Header menjadi lebih profesional.</w:t>
+      </w:r>
+    </w:p>
+    <w:p>
+      <w:pPr>
+        <w:numPr>
+          <w:ilvl w:val="0"/>
+          <w:numId w:val="14"/>
+        </w:numPr>
+      </w:pPr>
+      <w:r>
+        <w:t>Mengganti animasi CSS menjadi GSAP.</w:t>
+      </w:r>
+    </w:p>
+    <w:p>
+      <w:pPr>
+        <w:numPr>
+          <w:ilvl w:val="0"/>
+          <w:numId w:val="14"/>
+        </w:numPr>
+      </w:pPr>
+      <w:r>
+        <w:t>Menambahkan animasi logo.</w:t>
+      </w:r>
+    </w:p>
+    <w:p>
+      <w:pPr>
+        <w:numPr>
+          <w:ilvl w:val="0"/>
+          <w:numId w:val="14"/>
+        </w:numPr>
+      </w:pPr>
+      <w:r>
+        <w:t>Menambahkan animasi judul.</w:t>
+      </w:r>
+    </w:p>
+    <w:p>
+      <w:pPr>
+        <w:numPr>
+          <w:ilvl w:val="0"/>
+          <w:numId w:val="14"/>
+        </w:numPr>
+      </w:pPr>
+      <w:r>
+        <w:t>Menambahkan animasi menu.</w:t>
+      </w:r>
+    </w:p>
+    <w:p>
+      <w:pPr>
+        <w:numPr>
+          <w:ilvl w:val="0"/>
+          <w:numId w:val="14"/>
+        </w:numPr>
+      </w:pPr>
+      <w:r>
+        <w:t>Membuat transisi Header lebih smooth.</w:t>
+      </w:r>
+    </w:p>
+    <w:p>
+      <w:r>
+        <w:pict w14:anchorId="1AF4AF43">
+          <v:rect id="_x0000_i1131" style="width:0;height:1.5pt" o:hralign="center" o:hrstd="t" o:hr="t" fillcolor="#a0a0a0" stroked="f"/>
+        </w:pict>
+      </w:r>
+    </w:p>
+    <w:p>
+      <w:pPr>
+        <w:rPr>
+          <w:b/>
+          <w:bCs/>
+        </w:rPr>
+      </w:pPr>
+      <w:r>
+        <w:rPr>
+          <w:rFonts w:ascii="Segoe UI Emoji" w:hAnsi="Segoe UI Emoji" w:cs="Segoe UI Emoji"/>
+          <w:b/>
+          <w:bCs/>
+        </w:rPr>
+        <w:t>📋</w:t>
+      </w:r>
+      <w:r>
+        <w:rPr>
+          <w:b/>
+          <w:bCs/>
+        </w:rPr>
+        <w:t xml:space="preserve"> Rencana Pekerjaan Berikutnya</w:t>
+      </w:r>
+    </w:p>
+    <w:p>
+      <w:pPr>
+        <w:rPr>
+          <w:b/>
+          <w:bCs/>
+        </w:rPr>
+      </w:pPr>
+      <w:r>
+        <w:rPr>
+          <w:b/>
+          <w:bCs/>
+        </w:rPr>
+        <w:t>Tahap 1</w:t>
+      </w:r>
+    </w:p>
+    <w:p>
+      <w:r>
+        <w:lastRenderedPageBreak/>
+        <w:t>Header Premium</w:t>
+      </w:r>
+    </w:p>
+    <w:p>
+      <w:pPr>
+        <w:numPr>
+          <w:ilvl w:val="0"/>
+          <w:numId w:val="15"/>
+        </w:numPr>
+      </w:pPr>
+      <w:r>
+        <w:t>Animasi logo berputar pada porosnya (360°).</w:t>
+      </w:r>
+    </w:p>
+    <w:p>
+      <w:pPr>
+        <w:numPr>
+          <w:ilvl w:val="0"/>
+          <w:numId w:val="15"/>
+        </w:numPr>
+      </w:pPr>
+      <w:r>
+        <w:t xml:space="preserve">Efek reveal pada tulisan </w:t>
+      </w:r>
+      <w:r>
+        <w:rPr>
+          <w:b/>
+          <w:bCs/>
+        </w:rPr>
+        <w:t>POLDA PAPUA TENGAH</w:t>
+      </w:r>
+      <w:r>
+        <w:t>.</w:t>
+      </w:r>
+    </w:p>
+    <w:p>
+      <w:pPr>
+        <w:numPr>
+          <w:ilvl w:val="0"/>
+          <w:numId w:val="15"/>
+        </w:numPr>
+      </w:pPr>
+      <w:r>
+        <w:t>Menu muncul satu per satu.</w:t>
+      </w:r>
+    </w:p>
+    <w:p>
+      <w:pPr>
+        <w:numPr>
+          <w:ilvl w:val="0"/>
+          <w:numId w:val="15"/>
+        </w:numPr>
+      </w:pPr>
+      <w:r>
+        <w:t>Efek glow emas pada header.</w:t>
+      </w:r>
+    </w:p>
+    <w:p>
+      <w:pPr>
+        <w:numPr>
+          <w:ilvl w:val="0"/>
+          <w:numId w:val="15"/>
+        </w:numPr>
+      </w:pPr>
+      <w:r>
+        <w:t>Animasi turun/naik yang lebih halus.</w:t>
+      </w:r>
+    </w:p>
+    <w:p>
+      <w:r>
+        <w:pict w14:anchorId="37F45084">
+          <v:rect id="_x0000_i1132" style="width:0;height:1.5pt" o:hralign="center" o:hrstd="t" o:hr="t" fillcolor="#a0a0a0" stroked="f"/>
+        </w:pict>
+      </w:r>
+    </w:p>
+    <w:p>
+      <w:pPr>
+        <w:rPr>
+          <w:b/>
+          <w:bCs/>
+        </w:rPr>
+      </w:pPr>
+      <w:r>
+        <w:rPr>
+          <w:b/>
+          <w:bCs/>
+        </w:rPr>
+        <w:t>Tahap 2</w:t>
+      </w:r>
+    </w:p>
+    <w:p>
+      <w:r>
+        <w:t>Hero Premium</w:t>
+      </w:r>
+    </w:p>
+    <w:p>
+      <w:pPr>
+        <w:numPr>
+          <w:ilvl w:val="0"/>
+          <w:numId w:val="16"/>
+        </w:numPr>
+      </w:pPr>
+      <w:r>
+        <w:t xml:space="preserve">Memperbaiki posisi tombol </w:t>
+      </w:r>
+      <w:r>
+        <w:rPr>
+          <w:b/>
+          <w:bCs/>
+        </w:rPr>
+        <w:t>Selengkapnya</w:t>
+      </w:r>
+      <w:r>
+        <w:t xml:space="preserve"> agar presisi di tengah area transisi Hero–Footer.</w:t>
+      </w:r>
+    </w:p>
+    <w:p>
+      <w:pPr>
+        <w:numPr>
+          <w:ilvl w:val="0"/>
+          <w:numId w:val="16"/>
+        </w:numPr>
+      </w:pPr>
+      <w:r>
+        <w:t>Menambahkan efek hover premium pada tombol.</w:t>
+      </w:r>
+    </w:p>
+    <w:p>
+      <w:pPr>
+        <w:numPr>
+          <w:ilvl w:val="0"/>
+          <w:numId w:val="16"/>
+        </w:numPr>
+      </w:pPr>
+      <w:r>
+        <w:t>Menambahkan animasi Hero saat halaman pertama kali dibuka.</w:t>
+      </w:r>
+    </w:p>
+    <w:p>
+      <w:r>
+        <w:pict w14:anchorId="32C1B41E">
+          <v:rect id="_x0000_i1133" style="width:0;height:1.5pt" o:hralign="center" o:hrstd="t" o:hr="t" fillcolor="#a0a0a0" stroked="f"/>
+        </w:pict>
+      </w:r>
+    </w:p>
+    <w:p>
+      <w:pPr>
+        <w:rPr>
+          <w:b/>
+          <w:bCs/>
+        </w:rPr>
+      </w:pPr>
+      <w:r>
+        <w:rPr>
+          <w:b/>
+          <w:bCs/>
+        </w:rPr>
+        <w:t>Tahap 3</w:t>
+      </w:r>
+    </w:p>
+    <w:p>
+      <w:r>
+        <w:t>Homepage</w:t>
+      </w:r>
+    </w:p>
+    <w:p>
+      <w:r>
+        <w:t>Pembuatan section:</w:t>
+      </w:r>
+    </w:p>
+    <w:p>
+      <w:pPr>
+        <w:numPr>
+          <w:ilvl w:val="0"/>
+          <w:numId w:val="17"/>
+        </w:numPr>
+      </w:pPr>
+      <w:r>
+        <w:t>Sambutan Kapolda</w:t>
+      </w:r>
+    </w:p>
+    <w:p>
+      <w:pPr>
+        <w:numPr>
+          <w:ilvl w:val="0"/>
+          <w:numId w:val="17"/>
+        </w:numPr>
+      </w:pPr>
+      <w:r>
+        <w:t>Berita Terbaru</w:t>
+      </w:r>
+    </w:p>
+    <w:p>
+      <w:pPr>
+        <w:numPr>
+          <w:ilvl w:val="0"/>
+          <w:numId w:val="17"/>
+        </w:numPr>
+      </w:pPr>
+      <w:r>
+        <w:t>Layanan Kepolisian</w:t>
+      </w:r>
+    </w:p>
+    <w:p>
+      <w:pPr>
+        <w:numPr>
+          <w:ilvl w:val="0"/>
+          <w:numId w:val="17"/>
+        </w:numPr>
+      </w:pPr>
+      <w:r>
+        <w:t>Quick Access</w:t>
+      </w:r>
+    </w:p>
+    <w:p>
+      <w:pPr>
+        <w:numPr>
+          <w:ilvl w:val="0"/>
+          <w:numId w:val="17"/>
+        </w:numPr>
+      </w:pPr>
+      <w:r>
+        <w:t>Statistik</w:t>
+      </w:r>
+    </w:p>
+    <w:p>
+      <w:pPr>
+        <w:numPr>
+          <w:ilvl w:val="0"/>
+          <w:numId w:val="17"/>
+        </w:numPr>
+      </w:pPr>
+      <w:r>
+        <w:t>Agenda</w:t>
+      </w:r>
+    </w:p>
+    <w:p>
+      <w:pPr>
+        <w:numPr>
+          <w:ilvl w:val="0"/>
+          <w:numId w:val="17"/>
+        </w:numPr>
+      </w:pPr>
+      <w:r>
+        <w:t>Pengumuman</w:t>
+      </w:r>
+    </w:p>
+    <w:p>
+      <w:pPr>
+        <w:numPr>
+          <w:ilvl w:val="0"/>
+          <w:numId w:val="17"/>
+        </w:numPr>
+      </w:pPr>
+      <w:r>
+        <w:t>Galeri</w:t>
+      </w:r>
+    </w:p>
+    <w:p>
+      <w:pPr>
+        <w:numPr>
+          <w:ilvl w:val="0"/>
+          <w:numId w:val="17"/>
+        </w:numPr>
+      </w:pPr>
+      <w:r>
+        <w:t>Link Instansi</w:t>
+      </w:r>
+    </w:p>
+    <w:p>
+      <w:r>
+        <w:pict w14:anchorId="4C27A669">
+          <v:rect id="_x0000_i1134" style="width:0;height:1.5pt" o:hralign="center" o:hrstd="t" o:hr="t" fillcolor="#a0a0a0" stroked="f"/>
+        </w:pict>
+      </w:r>
+    </w:p>
+    <w:p>
+      <w:pPr>
+        <w:rPr>
+          <w:b/>
+          <w:bCs/>
+        </w:rPr>
+      </w:pPr>
+      <w:r>
+        <w:rPr>
+          <w:b/>
+          <w:bCs/>
+        </w:rPr>
+        <w:t>Tahap 4</w:t>
+      </w:r>
+    </w:p>
+    <w:p>
+      <w:r>
+        <w:t>Responsive</w:t>
+      </w:r>
+    </w:p>
+    <w:p>
+      <w:r>
+        <w:t>Optimasi tampilan:</w:t>
+      </w:r>
+    </w:p>
+    <w:p>
+      <w:pPr>
+        <w:numPr>
+          <w:ilvl w:val="0"/>
+          <w:numId w:val="18"/>
+        </w:numPr>
+      </w:pPr>
+      <w:r>
+        <w:t>Desktop</w:t>
+      </w:r>
+    </w:p>
+    <w:p>
+      <w:pPr>
+        <w:numPr>
+          <w:ilvl w:val="0"/>
+          <w:numId w:val="18"/>
+        </w:numPr>
+      </w:pPr>
+      <w:r>
+        <w:lastRenderedPageBreak/>
+        <w:t>Laptop</w:t>
+      </w:r>
+    </w:p>
+    <w:p>
+      <w:pPr>
+        <w:numPr>
+          <w:ilvl w:val="0"/>
+          <w:numId w:val="18"/>
+        </w:numPr>
+      </w:pPr>
+      <w:r>
+        <w:t>Tablet</w:t>
+      </w:r>
+    </w:p>
+    <w:p>
+      <w:pPr>
+        <w:numPr>
+          <w:ilvl w:val="0"/>
+          <w:numId w:val="18"/>
+        </w:numPr>
+      </w:pPr>
+      <w:r>
+        <w:t>Mobile</w:t>
+      </w:r>
+    </w:p>
+    <w:p>
+      <w:r>
+        <w:pict w14:anchorId="2827D6DF">
+          <v:rect id="_x0000_i1135" style="width:0;height:1.5pt" o:hralign="center" o:hrstd="t" o:hr="t" fillcolor="#a0a0a0" stroked="f"/>
+        </w:pict>
+      </w:r>
+    </w:p>
+    <w:p>
+      <w:pPr>
+        <w:rPr>
+          <w:b/>
+          <w:bCs/>
+        </w:rPr>
+      </w:pPr>
+      <w:r>
+        <w:rPr>
+          <w:b/>
+          <w:bCs/>
+        </w:rPr>
+        <w:t>Tahap 5</w:t>
+      </w:r>
+    </w:p>
+    <w:p>
+      <w:r>
+        <w:t>Optimasi</w:t>
+      </w:r>
+    </w:p>
+    <w:p>
+      <w:pPr>
+        <w:numPr>
+          <w:ilvl w:val="0"/>
+          <w:numId w:val="19"/>
+        </w:numPr>
+      </w:pPr>
+      <w:r>
+        <w:t>Lazy Loading</w:t>
+      </w:r>
+    </w:p>
+    <w:p>
+      <w:pPr>
+        <w:numPr>
+          <w:ilvl w:val="0"/>
+          <w:numId w:val="19"/>
+        </w:numPr>
+      </w:pPr>
+      <w:r>
+        <w:t>SEO</w:t>
+      </w:r>
+    </w:p>
+    <w:p>
+      <w:pPr>
+        <w:numPr>
+          <w:ilvl w:val="0"/>
+          <w:numId w:val="19"/>
+        </w:numPr>
+      </w:pPr>
+      <w:r>
+        <w:t>Performance</w:t>
+      </w:r>
+    </w:p>
+    <w:p>
+      <w:pPr>
+        <w:numPr>
+          <w:ilvl w:val="0"/>
+          <w:numId w:val="19"/>
+        </w:numPr>
+      </w:pPr>
+      <w:r>
+        <w:t>Accessibility</w:t>
+      </w:r>
+    </w:p>
+    <w:p>
+      <w:pPr>
+        <w:numPr>
+          <w:ilvl w:val="0"/>
+          <w:numId w:val="19"/>
+        </w:numPr>
+      </w:pPr>
+      <w:r>
+        <w:t>Struktur kode React</w:t>
+      </w:r>
+    </w:p>
+    <w:p>
+      <w:pPr>
+        <w:numPr>
+          <w:ilvl w:val="0"/>
+          <w:numId w:val="19"/>
+        </w:numPr>
+      </w:pPr>
+      <w:r>
+        <w:t>Reusable Components</w:t>
+      </w:r>
+    </w:p>
+    <w:p>
+      <w:r>
+        <w:pict w14:anchorId="1B6B02DA">
+          <v:rect id="_x0000_i1136" style="width:0;height:1.5pt" o:hralign="center" o:hrstd="t" o:hr="t" fillcolor="#a0a0a0" stroked="f"/>
+        </w:pict>
+      </w:r>
+    </w:p>
+    <w:p>
+      <w:pPr>
+        <w:rPr>
+          <w:b/>
+          <w:bCs/>
+        </w:rPr>
+      </w:pPr>
+      <w:r>
+        <w:rPr>
+          <w:b/>
+          <w:bCs/>
+        </w:rPr>
+        <w:t>Status Project Saat Ini</w:t>
+      </w:r>
+    </w:p>
+    <w:tbl>
+      <w:tblPr>
+        <w:tblW w:w="0" w:type="auto"/>
+        <w:tblCellSpacing w:w="15" w:type="dxa"/>
+        <w:tblCellMar>
+          <w:top w:w="15" w:type="dxa"/>
+          <w:left w:w="15" w:type="dxa"/>
+          <w:bottom w:w="15" w:type="dxa"/>
+          <w:right w:w="15" w:type="dxa"/>
+        </w:tblCellMar>
+        <w:tblLook w:val="04A0" w:firstRow="1" w:lastRow="0" w:firstColumn="1" w:lastColumn="0" w:noHBand="0" w:noVBand="1"/>
+      </w:tblPr>
+      <w:tblGrid>
+        <w:gridCol w:w="1934"/>
+        <w:gridCol w:w="4129"/>
+      </w:tblGrid>
+      <w:tr>
+        <w:trPr>
+          <w:tblHeader/>
+          <w:tblCellSpacing w:w="15" w:type="dxa"/>
+        </w:trPr>
+        <w:tc>
+          <w:tcPr>
+            <w:tcW w:w="0" w:type="auto"/>
+            <w:vAlign w:val="center"/>
+            <w:hideMark/>
+          </w:tcPr>
+          <w:p>
+            <w:pPr>
+              <w:rPr>
+                <w:b/>
+                <w:bCs/>
+              </w:rPr>
+            </w:pPr>
+            <w:r>
+              <w:rPr>
+                <w:b/>
+                <w:bCs/>
+              </w:rPr>
+              <w:t>Item</w:t>
+            </w:r>
+          </w:p>
+        </w:tc>
+        <w:tc>
+          <w:tcPr>
+            <w:tcW w:w="0" w:type="auto"/>
+            <w:vAlign w:val="center"/>
+            <w:hideMark/>
+          </w:tcPr>
+          <w:p>
+            <w:pPr>
+              <w:rPr>
+                <w:b/>
+                <w:bCs/>
+              </w:rPr>
+            </w:pPr>
+            <w:r>
+              <w:rPr>
+                <w:b/>
+                <w:bCs/>
+              </w:rPr>
+              <w:t>Status</w:t>
+            </w:r>
+          </w:p>
+        </w:tc>
+      </w:tr>
+      <w:tr>
+        <w:trPr>
+          <w:tblCellSpacing w:w="15" w:type="dxa"/>
+        </w:trPr>
+        <w:tc>
+          <w:tcPr>
+            <w:tcW w:w="0" w:type="auto"/>
+            <w:vAlign w:val="center"/>
+            <w:hideMark/>
+          </w:tcPr>
+          <w:p>
+            <w:r>
+              <w:t>Setup Project</w:t>
+            </w:r>
+          </w:p>
+        </w:tc>
+        <w:tc>
+          <w:tcPr>
+            <w:tcW w:w="0" w:type="auto"/>
+            <w:vAlign w:val="center"/>
+            <w:hideMark/>
+          </w:tcPr>
+          <w:p>
+            <w:r>
+              <w:rPr>
+                <w:rFonts w:ascii="Segoe UI Emoji" w:hAnsi="Segoe UI Emoji" w:cs="Segoe UI Emoji"/>
+              </w:rPr>
+              <w:t>✅</w:t>
+            </w:r>
+            <w:r>
+              <w:t xml:space="preserve"> Selesai</w:t>
+            </w:r>
+          </w:p>
+        </w:tc>
+      </w:tr>
+      <w:tr>
+        <w:trPr>
+          <w:tblCellSpacing w:w="15" w:type="dxa"/>
+        </w:trPr>
+        <w:tc>
+          <w:tcPr>
+            <w:tcW w:w="0" w:type="auto"/>
+            <w:vAlign w:val="center"/>
+            <w:hideMark/>
+          </w:tcPr>
+          <w:p>
+            <w:r>
+              <w:t>GitHub Repository</w:t>
+            </w:r>
+          </w:p>
+        </w:tc>
+        <w:tc>
+          <w:tcPr>
+            <w:tcW w:w="0" w:type="auto"/>
+            <w:vAlign w:val="center"/>
+            <w:hideMark/>
+          </w:tcPr>
+          <w:p>
+            <w:r>
+              <w:rPr>
+                <w:rFonts w:ascii="Segoe UI Emoji" w:hAnsi="Segoe UI Emoji" w:cs="Segoe UI Emoji"/>
+              </w:rPr>
+              <w:t>✅</w:t>
+            </w:r>
+            <w:r>
+              <w:t xml:space="preserve"> Selesai</w:t>
+            </w:r>
+          </w:p>
+        </w:tc>
+      </w:tr>
+      <w:tr>
+        <w:trPr>
+          <w:tblCellSpacing w:w="15" w:type="dxa"/>
+        </w:trPr>
+        <w:tc>
+          <w:tcPr>
+            <w:tcW w:w="0" w:type="auto"/>
+            <w:vAlign w:val="center"/>
+            <w:hideMark/>
+          </w:tcPr>
+          <w:p>
+            <w:r>
+              <w:t>GitHub Project</w:t>
+            </w:r>
+          </w:p>
+        </w:tc>
+        <w:tc>
+          <w:tcPr>
+            <w:tcW w:w="0" w:type="auto"/>
+            <w:vAlign w:val="center"/>
+            <w:hideMark/>
+          </w:tcPr>
+          <w:p>
+            <w:r>
+              <w:rPr>
+                <w:rFonts w:ascii="Segoe UI Emoji" w:hAnsi="Segoe UI Emoji" w:cs="Segoe UI Emoji"/>
+              </w:rPr>
+              <w:t>✅</w:t>
+            </w:r>
+            <w:r>
+              <w:t xml:space="preserve"> Selesai</w:t>
+            </w:r>
+          </w:p>
+        </w:tc>
+      </w:tr>
+      <w:tr>
+        <w:trPr>
+          <w:tblCellSpacing w:w="15" w:type="dxa"/>
+        </w:trPr>
+        <w:tc>
+          <w:tcPr>
+            <w:tcW w:w="0" w:type="auto"/>
+            <w:vAlign w:val="center"/>
+            <w:hideMark/>
+          </w:tcPr>
+          <w:p>
+            <w:r>
+              <w:t>Hero Section</w:t>
+            </w:r>
+          </w:p>
+        </w:tc>
+        <w:tc>
+          <w:tcPr>
+            <w:tcW w:w="0" w:type="auto"/>
+            <w:vAlign w:val="center"/>
+            <w:hideMark/>
+          </w:tcPr>
+          <w:p>
+            <w:r>
+              <w:rPr>
+                <w:rFonts w:ascii="Segoe UI Emoji" w:hAnsi="Segoe UI Emoji" w:cs="Segoe UI Emoji"/>
+              </w:rPr>
+              <w:t>✅</w:t>
+            </w:r>
+            <w:r>
+              <w:t xml:space="preserve"> 90%</w:t>
+            </w:r>
+          </w:p>
+        </w:tc>
+      </w:tr>
+      <w:tr>
+        <w:trPr>
+          <w:tblCellSpacing w:w="15" w:type="dxa"/>
+        </w:trPr>
+        <w:tc>
+          <w:tcPr>
+            <w:tcW w:w="0" w:type="auto"/>
+            <w:vAlign w:val="center"/>
+            <w:hideMark/>
+          </w:tcPr>
+          <w:p>
+            <w:r>
+              <w:t>Header</w:t>
+            </w:r>
+          </w:p>
+        </w:tc>
+        <w:tc>
+          <w:tcPr>
+            <w:tcW w:w="0" w:type="auto"/>
+            <w:vAlign w:val="center"/>
+            <w:hideMark/>
+          </w:tcPr>
+          <w:p>
+            <w:r>
+              <w:rPr>
+                <w:rFonts w:ascii="Segoe UI Emoji" w:hAnsi="Segoe UI Emoji" w:cs="Segoe UI Emoji"/>
+              </w:rPr>
+              <w:t>🔄</w:t>
+            </w:r>
+            <w:r>
+              <w:t xml:space="preserve"> Dalam Pengembangan (Refactor GSAP)</w:t>
+            </w:r>
+          </w:p>
+        </w:tc>
+      </w:tr>
+      <w:tr>
+        <w:trPr>
+          <w:tblCellSpacing w:w="15" w:type="dxa"/>
+        </w:trPr>
+        <w:tc>
+          <w:tcPr>
+            <w:tcW w:w="0" w:type="auto"/>
+            <w:vAlign w:val="center"/>
+            <w:hideMark/>
+          </w:tcPr>
+          <w:p>
+            <w:r>
+              <w:t>Footer</w:t>
+            </w:r>
+          </w:p>
+        </w:tc>
+        <w:tc>
+          <w:tcPr>
+            <w:tcW w:w="0" w:type="auto"/>
+            <w:vAlign w:val="center"/>
+            <w:hideMark/>
+          </w:tcPr>
+          <w:p>
+            <w:r>
+              <w:rPr>
+                <w:rFonts w:ascii="Segoe UI Emoji" w:hAnsi="Segoe UI Emoji" w:cs="Segoe UI Emoji"/>
+              </w:rPr>
+              <w:t>✅</w:t>
+            </w:r>
+            <w:r>
+              <w:t xml:space="preserve"> Selesai</w:t>
+            </w:r>
+          </w:p>
+        </w:tc>
+      </w:tr>
+      <w:tr>
+        <w:trPr>
+          <w:tblCellSpacing w:w="15" w:type="dxa"/>
+        </w:trPr>
+        <w:tc>
+          <w:tcPr>
+            <w:tcW w:w="0" w:type="auto"/>
+            <w:vAlign w:val="center"/>
+            <w:hideMark/>
+          </w:tcPr>
+          <w:p>
+            <w:r>
+              <w:t>Responsive</w:t>
+            </w:r>
+          </w:p>
+        </w:tc>
+        <w:tc>
+          <w:tcPr>
+            <w:tcW w:w="0" w:type="auto"/>
+            <w:vAlign w:val="center"/>
+            <w:hideMark/>
+          </w:tcPr>
+          <w:p>
+            <w:r>
+              <w:rPr>
+                <w:rFonts w:ascii="Segoe UI Emoji" w:hAnsi="Segoe UI Emoji" w:cs="Segoe UI Emoji"/>
+              </w:rPr>
+              <w:t>⏳</w:t>
+            </w:r>
+            <w:r>
+              <w:t xml:space="preserve"> Belum</w:t>
+            </w:r>
+          </w:p>
+        </w:tc>
+      </w:tr>
+      <w:tr>
+        <w:trPr>
+          <w:tblCellSpacing w:w="15" w:type="dxa"/>
+        </w:trPr>
+        <w:tc>
+          <w:tcPr>
+            <w:tcW w:w="0" w:type="auto"/>
+            <w:vAlign w:val="center"/>
+            <w:hideMark/>
+          </w:tcPr>
+          <w:p>
+            <w:r>
+              <w:t>Homepage Content</w:t>
+            </w:r>
+          </w:p>
+        </w:tc>
+        <w:tc>
+          <w:tcPr>
+            <w:tcW w:w="0" w:type="auto"/>
+            <w:vAlign w:val="center"/>
+            <w:hideMark/>
+          </w:tcPr>
+          <w:p>
+            <w:r>
+              <w:rPr>
+                <w:rFonts w:ascii="Segoe UI Emoji" w:hAnsi="Segoe UI Emoji" w:cs="Segoe UI Emoji"/>
+              </w:rPr>
+              <w:t>⏳</w:t>
+            </w:r>
+            <w:r>
+              <w:t xml:space="preserve"> Belum</w:t>
+            </w:r>
+          </w:p>
+        </w:tc>
+      </w:tr>
+      <w:tr>
+        <w:trPr>
+          <w:tblCellSpacing w:w="15" w:type="dxa"/>
+        </w:trPr>
+        <w:tc>
+          <w:tcPr>
+            <w:tcW w:w="0" w:type="auto"/>
+            <w:vAlign w:val="center"/>
+            <w:hideMark/>
+          </w:tcPr>
+          <w:p>
+            <w:r>
+              <w:t>Animasi Premium</w:t>
+            </w:r>
+          </w:p>
+        </w:tc>
+        <w:tc>
+          <w:tcPr>
+            <w:tcW w:w="0" w:type="auto"/>
+            <w:vAlign w:val="center"/>
+            <w:hideMark/>
+          </w:tcPr>
+          <w:p>
+            <w:r>
+              <w:rPr>
+                <w:rFonts w:ascii="Segoe UI Emoji" w:hAnsi="Segoe UI Emoji" w:cs="Segoe UI Emoji"/>
+              </w:rPr>
+              <w:t>🔄</w:t>
+            </w:r>
+            <w:r>
+              <w:t xml:space="preserve"> Sedang Dikerjakan</w:t>
+            </w:r>
+          </w:p>
+        </w:tc>
+      </w:tr>
+    </w:tbl>
+    <w:p>
+      <w:r>
+        <w:pict w14:anchorId="735936DD">
+          <v:rect id="_x0000_i1137" style="width:0;height:1.5pt" o:hralign="center" o:hrstd="t" o:hr="t" fillcolor="#a0a0a0" stroked="f"/>
+        </w:pict>
+      </w:r>
+    </w:p>
+    <w:p>
+      <w:pPr>
+        <w:rPr>
+          <w:b/>
+          <w:bCs/>
+        </w:rPr>
+      </w:pPr>
+      <w:r>
+        <w:rPr>
+          <w:b/>
+          <w:bCs/>
+        </w:rPr>
+        <w:t>Catatan</w:t>
+      </w:r>
+    </w:p>
+    <w:p>
+      <w:r>
+        <w:t xml:space="preserve">Fokus pekerjaan berikutnya adalah </w:t>
+      </w:r>
+      <w:r>
+        <w:rPr>
+          <w:b/>
+          <w:bCs/>
+        </w:rPr>
+        <w:t>menyelesaikan refactor Header menggunakan GSAP</w:t>
+      </w:r>
+      <w:r>
+        <w:t>. Setelah header benar-benar stabil, kita akan melanjutkan ke penyempurnaan Hero dan mulai membangun section-section utama homepage agar tampil modern, profesional, dan sesuai standar website resmi Polda Papua Tengah.</w:t>
+      </w:r>
+    </w:p>
+    <w:p/>
+    <w:p/>
+    <w:p/>
+    <w:p/>
+    <w:p/>
+    <w:p/>
+    <w:p/>
     <w:p>
       <w:r>
         <w:t xml:space="preserve">Berikut adalah </w:t>
@@ -952,7 +2706,7 @@
     <w:p>
       <w:r>
         <w:pict w14:anchorId="61A014D6">
-          <v:rect id="_x0000_i1073" style="width:0;height:1.5pt" o:hralign="center" o:hrstd="t" o:hr="t" fillcolor="#a0a0a0" stroked="f"/>
+          <v:rect id="_x0000_i1025" style="width:0;height:1.5pt" o:hralign="center" o:hrstd="t" o:hr="t" fillcolor="#a0a0a0" stroked="f"/>
         </w:pict>
       </w:r>
     </w:p>
@@ -1011,6 +2765,7 @@
                 <w:b/>
                 <w:bCs/>
               </w:rPr>
+              <w:lastRenderedPageBreak/>
               <w:t>No</w:t>
             </w:r>
           </w:p>
@@ -1277,7 +3032,6 @@
           </w:tcPr>
           <w:p>
             <w:r>
-              <w:lastRenderedPageBreak/>
               <w:t>6</w:t>
             </w:r>
           </w:p>
@@ -1434,7 +3188,7 @@
     <w:p>
       <w:r>
         <w:pict w14:anchorId="554C3520">
-          <v:rect id="_x0000_i1074" style="width:0;height:1.5pt" o:hralign="center" o:hrstd="t" o:hr="t" fillcolor="#a0a0a0" stroked="f"/>
+          <v:rect id="_x0000_i1026" style="width:0;height:1.5pt" o:hralign="center" o:hrstd="t" o:hr="t" fillcolor="#a0a0a0" stroked="f"/>
         </w:pict>
       </w:r>
     </w:p>
@@ -1874,7 +3628,7 @@
     <w:p>
       <w:r>
         <w:pict w14:anchorId="679EEF3B">
-          <v:rect id="_x0000_i1075" style="width:0;height:1.5pt" o:hralign="center" o:hrstd="t" o:hr="t" fillcolor="#a0a0a0" stroked="f"/>
+          <v:rect id="_x0000_i1027" style="width:0;height:1.5pt" o:hralign="center" o:hrstd="t" o:hr="t" fillcolor="#a0a0a0" stroked="f"/>
         </w:pict>
       </w:r>
     </w:p>
@@ -2117,6 +3871,7 @@
           </w:tcPr>
           <w:p>
             <w:r>
+              <w:lastRenderedPageBreak/>
               <w:t>4</w:t>
             </w:r>
           </w:p>
@@ -2273,7 +4028,7 @@
     <w:p>
       <w:r>
         <w:pict w14:anchorId="574C85C5">
-          <v:rect id="_x0000_i1076" style="width:0;height:1.5pt" o:hralign="center" o:hrstd="t" o:hr="t" fillcolor="#a0a0a0" stroked="f"/>
+          <v:rect id="_x0000_i1028" style="width:0;height:1.5pt" o:hralign="center" o:hrstd="t" o:hr="t" fillcolor="#a0a0a0" stroked="f"/>
         </w:pict>
       </w:r>
     </w:p>
@@ -2332,7 +4087,6 @@
                 <w:b/>
                 <w:bCs/>
               </w:rPr>
-              <w:lastRenderedPageBreak/>
               <w:t>No</w:t>
             </w:r>
           </w:p>
@@ -2796,7 +4550,7 @@
     <w:p>
       <w:r>
         <w:pict w14:anchorId="2DB4C084">
-          <v:rect id="_x0000_i1077" style="width:0;height:1.5pt" o:hralign="center" o:hrstd="t" o:hr="t" fillcolor="#a0a0a0" stroked="f"/>
+          <v:rect id="_x0000_i1029" style="width:0;height:1.5pt" o:hralign="center" o:hrstd="t" o:hr="t" fillcolor="#a0a0a0" stroked="f"/>
         </w:pict>
       </w:r>
     </w:p>
@@ -3195,7 +4949,7 @@
     <w:p>
       <w:r>
         <w:pict w14:anchorId="0A4A5BA7">
-          <v:rect id="_x0000_i1078" style="width:0;height:1.5pt" o:hralign="center" o:hrstd="t" o:hr="t" fillcolor="#a0a0a0" stroked="f"/>
+          <v:rect id="_x0000_i1030" style="width:0;height:1.5pt" o:hralign="center" o:hrstd="t" o:hr="t" fillcolor="#a0a0a0" stroked="f"/>
         </w:pict>
       </w:r>
     </w:p>
@@ -3438,7 +5192,6 @@
           </w:tcPr>
           <w:p>
             <w:r>
-              <w:lastRenderedPageBreak/>
               <w:t>4</w:t>
             </w:r>
           </w:p>
@@ -3595,7 +5348,7 @@
     <w:p>
       <w:r>
         <w:pict w14:anchorId="61AAC505">
-          <v:rect id="_x0000_i1079" style="width:0;height:1.5pt" o:hralign="center" o:hrstd="t" o:hr="t" fillcolor="#a0a0a0" stroked="f"/>
+          <v:rect id="_x0000_i1031" style="width:0;height:1.5pt" o:hralign="center" o:hrstd="t" o:hr="t" fillcolor="#a0a0a0" stroked="f"/>
         </w:pict>
       </w:r>
     </w:p>
@@ -3994,7 +5747,7 @@
     <w:p>
       <w:r>
         <w:pict w14:anchorId="6F554939">
-          <v:rect id="_x0000_i1080" style="width:0;height:1.5pt" o:hralign="center" o:hrstd="t" o:hr="t" fillcolor="#a0a0a0" stroked="f"/>
+          <v:rect id="_x0000_i1032" style="width:0;height:1.5pt" o:hralign="center" o:hrstd="t" o:hr="t" fillcolor="#a0a0a0" stroked="f"/>
         </w:pict>
       </w:r>
     </w:p>
@@ -4182,7 +5935,6 @@
           <w:b/>
           <w:bCs/>
         </w:rPr>
-        <w:lastRenderedPageBreak/>
         <w:t>🔴</w:t>
       </w:r>
       <w:r>
@@ -4654,7 +6406,6 @@
         <w:rPr>
           <w:rFonts w:ascii="Segoe UI Emoji" w:hAnsi="Segoe UI Emoji" w:cs="Segoe UI Emoji"/>
         </w:rPr>
-        <w:lastRenderedPageBreak/>
         <w:t>🔴</w:t>
       </w:r>
       <w:r>
@@ -4853,6 +6604,155 @@
     </w:lvl>
   </w:abstractNum>
   <w:abstractNum w:abstractNumId="1" w15:restartNumberingAfterBreak="0">
+    <w:nsid w:val="18733191"/>
+    <w:multiLevelType w:val="multilevel"/>
+    <w:tmpl w:val="AB6AA460"/>
+    <w:lvl w:ilvl="0">
+      <w:start w:val="1"/>
+      <w:numFmt w:val="bullet"/>
+      <w:lvlText w:val=""/>
+      <w:lvlJc w:val="left"/>
+      <w:pPr>
+        <w:tabs>
+          <w:tab w:val="num" w:pos="720"/>
+        </w:tabs>
+        <w:ind w:left="720" w:hanging="360"/>
+      </w:pPr>
+      <w:rPr>
+        <w:rFonts w:ascii="Symbol" w:hAnsi="Symbol" w:hint="default"/>
+        <w:sz w:val="20"/>
+      </w:rPr>
+    </w:lvl>
+    <w:lvl w:ilvl="1" w:tentative="1">
+      <w:start w:val="1"/>
+      <w:numFmt w:val="bullet"/>
+      <w:lvlText w:val="o"/>
+      <w:lvlJc w:val="left"/>
+      <w:pPr>
+        <w:tabs>
+          <w:tab w:val="num" w:pos="1440"/>
+        </w:tabs>
+        <w:ind w:left="1440" w:hanging="360"/>
+      </w:pPr>
+      <w:rPr>
+        <w:rFonts w:ascii="Courier New" w:hAnsi="Courier New" w:hint="default"/>
+        <w:sz w:val="20"/>
+      </w:rPr>
+    </w:lvl>
+    <w:lvl w:ilvl="2" w:tentative="1">
+      <w:start w:val="1"/>
+      <w:numFmt w:val="bullet"/>
+      <w:lvlText w:val=""/>
+      <w:lvlJc w:val="left"/>
+      <w:pPr>
+        <w:tabs>
+          <w:tab w:val="num" w:pos="2160"/>
+        </w:tabs>
+        <w:ind w:left="2160" w:hanging="360"/>
+      </w:pPr>
+      <w:rPr>
+        <w:rFonts w:ascii="Wingdings" w:hAnsi="Wingdings" w:hint="default"/>
+        <w:sz w:val="20"/>
+      </w:rPr>
+    </w:lvl>
+    <w:lvl w:ilvl="3" w:tentative="1">
+      <w:start w:val="1"/>
+      <w:numFmt w:val="bullet"/>
+      <w:lvlText w:val=""/>
+      <w:lvlJc w:val="left"/>
+      <w:pPr>
+        <w:tabs>
+          <w:tab w:val="num" w:pos="2880"/>
+        </w:tabs>
+        <w:ind w:left="2880" w:hanging="360"/>
+      </w:pPr>
+      <w:rPr>
+        <w:rFonts w:ascii="Wingdings" w:hAnsi="Wingdings" w:hint="default"/>
+        <w:sz w:val="20"/>
+      </w:rPr>
+    </w:lvl>
+    <w:lvl w:ilvl="4" w:tentative="1">
+      <w:start w:val="1"/>
+      <w:numFmt w:val="bullet"/>
+      <w:lvlText w:val=""/>
+      <w:lvlJc w:val="left"/>
+      <w:pPr>
+        <w:tabs>
+          <w:tab w:val="num" w:pos="3600"/>
+        </w:tabs>
+        <w:ind w:left="3600" w:hanging="360"/>
+      </w:pPr>
+      <w:rPr>
+        <w:rFonts w:ascii="Wingdings" w:hAnsi="Wingdings" w:hint="default"/>
+        <w:sz w:val="20"/>
+      </w:rPr>
+    </w:lvl>
+    <w:lvl w:ilvl="5" w:tentative="1">
+      <w:start w:val="1"/>
+      <w:numFmt w:val="bullet"/>
+      <w:lvlText w:val=""/>
+      <w:lvlJc w:val="left"/>
+      <w:pPr>
+        <w:tabs>
+          <w:tab w:val="num" w:pos="4320"/>
+        </w:tabs>
+        <w:ind w:left="4320" w:hanging="360"/>
+      </w:pPr>
+      <w:rPr>
+        <w:rFonts w:ascii="Wingdings" w:hAnsi="Wingdings" w:hint="default"/>
+        <w:sz w:val="20"/>
+      </w:rPr>
+    </w:lvl>
+    <w:lvl w:ilvl="6" w:tentative="1">
+      <w:start w:val="1"/>
+      <w:numFmt w:val="bullet"/>
+      <w:lvlText w:val=""/>
+      <w:lvlJc w:val="left"/>
+      <w:pPr>
+        <w:tabs>
+          <w:tab w:val="num" w:pos="5040"/>
+        </w:tabs>
+        <w:ind w:left="5040" w:hanging="360"/>
+      </w:pPr>
+      <w:rPr>
+        <w:rFonts w:ascii="Wingdings" w:hAnsi="Wingdings" w:hint="default"/>
+        <w:sz w:val="20"/>
+      </w:rPr>
+    </w:lvl>
+    <w:lvl w:ilvl="7" w:tentative="1">
+      <w:start w:val="1"/>
+      <w:numFmt w:val="bullet"/>
+      <w:lvlText w:val=""/>
+      <w:lvlJc w:val="left"/>
+      <w:pPr>
+        <w:tabs>
+          <w:tab w:val="num" w:pos="5760"/>
+        </w:tabs>
+        <w:ind w:left="5760" w:hanging="360"/>
+      </w:pPr>
+      <w:rPr>
+        <w:rFonts w:ascii="Wingdings" w:hAnsi="Wingdings" w:hint="default"/>
+        <w:sz w:val="20"/>
+      </w:rPr>
+    </w:lvl>
+    <w:lvl w:ilvl="8" w:tentative="1">
+      <w:start w:val="1"/>
+      <w:numFmt w:val="bullet"/>
+      <w:lvlText w:val=""/>
+      <w:lvlJc w:val="left"/>
+      <w:pPr>
+        <w:tabs>
+          <w:tab w:val="num" w:pos="6480"/>
+        </w:tabs>
+        <w:ind w:left="6480" w:hanging="360"/>
+      </w:pPr>
+      <w:rPr>
+        <w:rFonts w:ascii="Wingdings" w:hAnsi="Wingdings" w:hint="default"/>
+        <w:sz w:val="20"/>
+      </w:rPr>
+    </w:lvl>
+  </w:abstractNum>
+  <w:abstractNum w:abstractNumId="2" w15:restartNumberingAfterBreak="0">
     <w:nsid w:val="1E7816C6"/>
     <w:multiLevelType w:val="multilevel"/>
     <w:tmpl w:val="AA72706C"/>
@@ -5001,7 +6901,901 @@
       </w:rPr>
     </w:lvl>
   </w:abstractNum>
-  <w:abstractNum w:abstractNumId="2" w15:restartNumberingAfterBreak="0">
+  <w:abstractNum w:abstractNumId="3" w15:restartNumberingAfterBreak="0">
+    <w:nsid w:val="21811181"/>
+    <w:multiLevelType w:val="multilevel"/>
+    <w:tmpl w:val="76E835A4"/>
+    <w:lvl w:ilvl="0">
+      <w:start w:val="1"/>
+      <w:numFmt w:val="bullet"/>
+      <w:lvlText w:val=""/>
+      <w:lvlJc w:val="left"/>
+      <w:pPr>
+        <w:tabs>
+          <w:tab w:val="num" w:pos="720"/>
+        </w:tabs>
+        <w:ind w:left="720" w:hanging="360"/>
+      </w:pPr>
+      <w:rPr>
+        <w:rFonts w:ascii="Symbol" w:hAnsi="Symbol" w:hint="default"/>
+        <w:sz w:val="20"/>
+      </w:rPr>
+    </w:lvl>
+    <w:lvl w:ilvl="1" w:tentative="1">
+      <w:start w:val="1"/>
+      <w:numFmt w:val="bullet"/>
+      <w:lvlText w:val="o"/>
+      <w:lvlJc w:val="left"/>
+      <w:pPr>
+        <w:tabs>
+          <w:tab w:val="num" w:pos="1440"/>
+        </w:tabs>
+        <w:ind w:left="1440" w:hanging="360"/>
+      </w:pPr>
+      <w:rPr>
+        <w:rFonts w:ascii="Courier New" w:hAnsi="Courier New" w:hint="default"/>
+        <w:sz w:val="20"/>
+      </w:rPr>
+    </w:lvl>
+    <w:lvl w:ilvl="2" w:tentative="1">
+      <w:start w:val="1"/>
+      <w:numFmt w:val="bullet"/>
+      <w:lvlText w:val=""/>
+      <w:lvlJc w:val="left"/>
+      <w:pPr>
+        <w:tabs>
+          <w:tab w:val="num" w:pos="2160"/>
+        </w:tabs>
+        <w:ind w:left="2160" w:hanging="360"/>
+      </w:pPr>
+      <w:rPr>
+        <w:rFonts w:ascii="Wingdings" w:hAnsi="Wingdings" w:hint="default"/>
+        <w:sz w:val="20"/>
+      </w:rPr>
+    </w:lvl>
+    <w:lvl w:ilvl="3" w:tentative="1">
+      <w:start w:val="1"/>
+      <w:numFmt w:val="bullet"/>
+      <w:lvlText w:val=""/>
+      <w:lvlJc w:val="left"/>
+      <w:pPr>
+        <w:tabs>
+          <w:tab w:val="num" w:pos="2880"/>
+        </w:tabs>
+        <w:ind w:left="2880" w:hanging="360"/>
+      </w:pPr>
+      <w:rPr>
+        <w:rFonts w:ascii="Wingdings" w:hAnsi="Wingdings" w:hint="default"/>
+        <w:sz w:val="20"/>
+      </w:rPr>
+    </w:lvl>
+    <w:lvl w:ilvl="4" w:tentative="1">
+      <w:start w:val="1"/>
+      <w:numFmt w:val="bullet"/>
+      <w:lvlText w:val=""/>
+      <w:lvlJc w:val="left"/>
+      <w:pPr>
+        <w:tabs>
+          <w:tab w:val="num" w:pos="3600"/>
+        </w:tabs>
+        <w:ind w:left="3600" w:hanging="360"/>
+      </w:pPr>
+      <w:rPr>
+        <w:rFonts w:ascii="Wingdings" w:hAnsi="Wingdings" w:hint="default"/>
+        <w:sz w:val="20"/>
+      </w:rPr>
+    </w:lvl>
+    <w:lvl w:ilvl="5" w:tentative="1">
+      <w:start w:val="1"/>
+      <w:numFmt w:val="bullet"/>
+      <w:lvlText w:val=""/>
+      <w:lvlJc w:val="left"/>
+      <w:pPr>
+        <w:tabs>
+          <w:tab w:val="num" w:pos="4320"/>
+        </w:tabs>
+        <w:ind w:left="4320" w:hanging="360"/>
+      </w:pPr>
+      <w:rPr>
+        <w:rFonts w:ascii="Wingdings" w:hAnsi="Wingdings" w:hint="default"/>
+        <w:sz w:val="20"/>
+      </w:rPr>
+    </w:lvl>
+    <w:lvl w:ilvl="6" w:tentative="1">
+      <w:start w:val="1"/>
+      <w:numFmt w:val="bullet"/>
+      <w:lvlText w:val=""/>
+      <w:lvlJc w:val="left"/>
+      <w:pPr>
+        <w:tabs>
+          <w:tab w:val="num" w:pos="5040"/>
+        </w:tabs>
+        <w:ind w:left="5040" w:hanging="360"/>
+      </w:pPr>
+      <w:rPr>
+        <w:rFonts w:ascii="Wingdings" w:hAnsi="Wingdings" w:hint="default"/>
+        <w:sz w:val="20"/>
+      </w:rPr>
+    </w:lvl>
+    <w:lvl w:ilvl="7" w:tentative="1">
+      <w:start w:val="1"/>
+      <w:numFmt w:val="bullet"/>
+      <w:lvlText w:val=""/>
+      <w:lvlJc w:val="left"/>
+      <w:pPr>
+        <w:tabs>
+          <w:tab w:val="num" w:pos="5760"/>
+        </w:tabs>
+        <w:ind w:left="5760" w:hanging="360"/>
+      </w:pPr>
+      <w:rPr>
+        <w:rFonts w:ascii="Wingdings" w:hAnsi="Wingdings" w:hint="default"/>
+        <w:sz w:val="20"/>
+      </w:rPr>
+    </w:lvl>
+    <w:lvl w:ilvl="8" w:tentative="1">
+      <w:start w:val="1"/>
+      <w:numFmt w:val="bullet"/>
+      <w:lvlText w:val=""/>
+      <w:lvlJc w:val="left"/>
+      <w:pPr>
+        <w:tabs>
+          <w:tab w:val="num" w:pos="6480"/>
+        </w:tabs>
+        <w:ind w:left="6480" w:hanging="360"/>
+      </w:pPr>
+      <w:rPr>
+        <w:rFonts w:ascii="Wingdings" w:hAnsi="Wingdings" w:hint="default"/>
+        <w:sz w:val="20"/>
+      </w:rPr>
+    </w:lvl>
+  </w:abstractNum>
+  <w:abstractNum w:abstractNumId="4" w15:restartNumberingAfterBreak="0">
+    <w:nsid w:val="389611AB"/>
+    <w:multiLevelType w:val="multilevel"/>
+    <w:tmpl w:val="0EFC4EDC"/>
+    <w:lvl w:ilvl="0">
+      <w:start w:val="1"/>
+      <w:numFmt w:val="bullet"/>
+      <w:lvlText w:val=""/>
+      <w:lvlJc w:val="left"/>
+      <w:pPr>
+        <w:tabs>
+          <w:tab w:val="num" w:pos="720"/>
+        </w:tabs>
+        <w:ind w:left="720" w:hanging="360"/>
+      </w:pPr>
+      <w:rPr>
+        <w:rFonts w:ascii="Symbol" w:hAnsi="Symbol" w:hint="default"/>
+        <w:sz w:val="20"/>
+      </w:rPr>
+    </w:lvl>
+    <w:lvl w:ilvl="1" w:tentative="1">
+      <w:start w:val="1"/>
+      <w:numFmt w:val="bullet"/>
+      <w:lvlText w:val="o"/>
+      <w:lvlJc w:val="left"/>
+      <w:pPr>
+        <w:tabs>
+          <w:tab w:val="num" w:pos="1440"/>
+        </w:tabs>
+        <w:ind w:left="1440" w:hanging="360"/>
+      </w:pPr>
+      <w:rPr>
+        <w:rFonts w:ascii="Courier New" w:hAnsi="Courier New" w:hint="default"/>
+        <w:sz w:val="20"/>
+      </w:rPr>
+    </w:lvl>
+    <w:lvl w:ilvl="2" w:tentative="1">
+      <w:start w:val="1"/>
+      <w:numFmt w:val="bullet"/>
+      <w:lvlText w:val=""/>
+      <w:lvlJc w:val="left"/>
+      <w:pPr>
+        <w:tabs>
+          <w:tab w:val="num" w:pos="2160"/>
+        </w:tabs>
+        <w:ind w:left="2160" w:hanging="360"/>
+      </w:pPr>
+      <w:rPr>
+        <w:rFonts w:ascii="Wingdings" w:hAnsi="Wingdings" w:hint="default"/>
+        <w:sz w:val="20"/>
+      </w:rPr>
+    </w:lvl>
+    <w:lvl w:ilvl="3" w:tentative="1">
+      <w:start w:val="1"/>
+      <w:numFmt w:val="bullet"/>
+      <w:lvlText w:val=""/>
+      <w:lvlJc w:val="left"/>
+      <w:pPr>
+        <w:tabs>
+          <w:tab w:val="num" w:pos="2880"/>
+        </w:tabs>
+        <w:ind w:left="2880" w:hanging="360"/>
+      </w:pPr>
+      <w:rPr>
+        <w:rFonts w:ascii="Wingdings" w:hAnsi="Wingdings" w:hint="default"/>
+        <w:sz w:val="20"/>
+      </w:rPr>
+    </w:lvl>
+    <w:lvl w:ilvl="4" w:tentative="1">
+      <w:start w:val="1"/>
+      <w:numFmt w:val="bullet"/>
+      <w:lvlText w:val=""/>
+      <w:lvlJc w:val="left"/>
+      <w:pPr>
+        <w:tabs>
+          <w:tab w:val="num" w:pos="3600"/>
+        </w:tabs>
+        <w:ind w:left="3600" w:hanging="360"/>
+      </w:pPr>
+      <w:rPr>
+        <w:rFonts w:ascii="Wingdings" w:hAnsi="Wingdings" w:hint="default"/>
+        <w:sz w:val="20"/>
+      </w:rPr>
+    </w:lvl>
+    <w:lvl w:ilvl="5" w:tentative="1">
+      <w:start w:val="1"/>
+      <w:numFmt w:val="bullet"/>
+      <w:lvlText w:val=""/>
+      <w:lvlJc w:val="left"/>
+      <w:pPr>
+        <w:tabs>
+          <w:tab w:val="num" w:pos="4320"/>
+        </w:tabs>
+        <w:ind w:left="4320" w:hanging="360"/>
+      </w:pPr>
+      <w:rPr>
+        <w:rFonts w:ascii="Wingdings" w:hAnsi="Wingdings" w:hint="default"/>
+        <w:sz w:val="20"/>
+      </w:rPr>
+    </w:lvl>
+    <w:lvl w:ilvl="6" w:tentative="1">
+      <w:start w:val="1"/>
+      <w:numFmt w:val="bullet"/>
+      <w:lvlText w:val=""/>
+      <w:lvlJc w:val="left"/>
+      <w:pPr>
+        <w:tabs>
+          <w:tab w:val="num" w:pos="5040"/>
+        </w:tabs>
+        <w:ind w:left="5040" w:hanging="360"/>
+      </w:pPr>
+      <w:rPr>
+        <w:rFonts w:ascii="Wingdings" w:hAnsi="Wingdings" w:hint="default"/>
+        <w:sz w:val="20"/>
+      </w:rPr>
+    </w:lvl>
+    <w:lvl w:ilvl="7" w:tentative="1">
+      <w:start w:val="1"/>
+      <w:numFmt w:val="bullet"/>
+      <w:lvlText w:val=""/>
+      <w:lvlJc w:val="left"/>
+      <w:pPr>
+        <w:tabs>
+          <w:tab w:val="num" w:pos="5760"/>
+        </w:tabs>
+        <w:ind w:left="5760" w:hanging="360"/>
+      </w:pPr>
+      <w:rPr>
+        <w:rFonts w:ascii="Wingdings" w:hAnsi="Wingdings" w:hint="default"/>
+        <w:sz w:val="20"/>
+      </w:rPr>
+    </w:lvl>
+    <w:lvl w:ilvl="8" w:tentative="1">
+      <w:start w:val="1"/>
+      <w:numFmt w:val="bullet"/>
+      <w:lvlText w:val=""/>
+      <w:lvlJc w:val="left"/>
+      <w:pPr>
+        <w:tabs>
+          <w:tab w:val="num" w:pos="6480"/>
+        </w:tabs>
+        <w:ind w:left="6480" w:hanging="360"/>
+      </w:pPr>
+      <w:rPr>
+        <w:rFonts w:ascii="Wingdings" w:hAnsi="Wingdings" w:hint="default"/>
+        <w:sz w:val="20"/>
+      </w:rPr>
+    </w:lvl>
+  </w:abstractNum>
+  <w:abstractNum w:abstractNumId="5" w15:restartNumberingAfterBreak="0">
+    <w:nsid w:val="38B35F81"/>
+    <w:multiLevelType w:val="multilevel"/>
+    <w:tmpl w:val="3530CAFC"/>
+    <w:lvl w:ilvl="0">
+      <w:start w:val="1"/>
+      <w:numFmt w:val="bullet"/>
+      <w:lvlText w:val=""/>
+      <w:lvlJc w:val="left"/>
+      <w:pPr>
+        <w:tabs>
+          <w:tab w:val="num" w:pos="720"/>
+        </w:tabs>
+        <w:ind w:left="720" w:hanging="360"/>
+      </w:pPr>
+      <w:rPr>
+        <w:rFonts w:ascii="Symbol" w:hAnsi="Symbol" w:hint="default"/>
+        <w:sz w:val="20"/>
+      </w:rPr>
+    </w:lvl>
+    <w:lvl w:ilvl="1" w:tentative="1">
+      <w:start w:val="1"/>
+      <w:numFmt w:val="bullet"/>
+      <w:lvlText w:val="o"/>
+      <w:lvlJc w:val="left"/>
+      <w:pPr>
+        <w:tabs>
+          <w:tab w:val="num" w:pos="1440"/>
+        </w:tabs>
+        <w:ind w:left="1440" w:hanging="360"/>
+      </w:pPr>
+      <w:rPr>
+        <w:rFonts w:ascii="Courier New" w:hAnsi="Courier New" w:hint="default"/>
+        <w:sz w:val="20"/>
+      </w:rPr>
+    </w:lvl>
+    <w:lvl w:ilvl="2" w:tentative="1">
+      <w:start w:val="1"/>
+      <w:numFmt w:val="bullet"/>
+      <w:lvlText w:val=""/>
+      <w:lvlJc w:val="left"/>
+      <w:pPr>
+        <w:tabs>
+          <w:tab w:val="num" w:pos="2160"/>
+        </w:tabs>
+        <w:ind w:left="2160" w:hanging="360"/>
+      </w:pPr>
+      <w:rPr>
+        <w:rFonts w:ascii="Wingdings" w:hAnsi="Wingdings" w:hint="default"/>
+        <w:sz w:val="20"/>
+      </w:rPr>
+    </w:lvl>
+    <w:lvl w:ilvl="3" w:tentative="1">
+      <w:start w:val="1"/>
+      <w:numFmt w:val="bullet"/>
+      <w:lvlText w:val=""/>
+      <w:lvlJc w:val="left"/>
+      <w:pPr>
+        <w:tabs>
+          <w:tab w:val="num" w:pos="2880"/>
+        </w:tabs>
+        <w:ind w:left="2880" w:hanging="360"/>
+      </w:pPr>
+      <w:rPr>
+        <w:rFonts w:ascii="Wingdings" w:hAnsi="Wingdings" w:hint="default"/>
+        <w:sz w:val="20"/>
+      </w:rPr>
+    </w:lvl>
+    <w:lvl w:ilvl="4" w:tentative="1">
+      <w:start w:val="1"/>
+      <w:numFmt w:val="bullet"/>
+      <w:lvlText w:val=""/>
+      <w:lvlJc w:val="left"/>
+      <w:pPr>
+        <w:tabs>
+          <w:tab w:val="num" w:pos="3600"/>
+        </w:tabs>
+        <w:ind w:left="3600" w:hanging="360"/>
+      </w:pPr>
+      <w:rPr>
+        <w:rFonts w:ascii="Wingdings" w:hAnsi="Wingdings" w:hint="default"/>
+        <w:sz w:val="20"/>
+      </w:rPr>
+    </w:lvl>
+    <w:lvl w:ilvl="5" w:tentative="1">
+      <w:start w:val="1"/>
+      <w:numFmt w:val="bullet"/>
+      <w:lvlText w:val=""/>
+      <w:lvlJc w:val="left"/>
+      <w:pPr>
+        <w:tabs>
+          <w:tab w:val="num" w:pos="4320"/>
+        </w:tabs>
+        <w:ind w:left="4320" w:hanging="360"/>
+      </w:pPr>
+      <w:rPr>
+        <w:rFonts w:ascii="Wingdings" w:hAnsi="Wingdings" w:hint="default"/>
+        <w:sz w:val="20"/>
+      </w:rPr>
+    </w:lvl>
+    <w:lvl w:ilvl="6" w:tentative="1">
+      <w:start w:val="1"/>
+      <w:numFmt w:val="bullet"/>
+      <w:lvlText w:val=""/>
+      <w:lvlJc w:val="left"/>
+      <w:pPr>
+        <w:tabs>
+          <w:tab w:val="num" w:pos="5040"/>
+        </w:tabs>
+        <w:ind w:left="5040" w:hanging="360"/>
+      </w:pPr>
+      <w:rPr>
+        <w:rFonts w:ascii="Wingdings" w:hAnsi="Wingdings" w:hint="default"/>
+        <w:sz w:val="20"/>
+      </w:rPr>
+    </w:lvl>
+    <w:lvl w:ilvl="7" w:tentative="1">
+      <w:start w:val="1"/>
+      <w:numFmt w:val="bullet"/>
+      <w:lvlText w:val=""/>
+      <w:lvlJc w:val="left"/>
+      <w:pPr>
+        <w:tabs>
+          <w:tab w:val="num" w:pos="5760"/>
+        </w:tabs>
+        <w:ind w:left="5760" w:hanging="360"/>
+      </w:pPr>
+      <w:rPr>
+        <w:rFonts w:ascii="Wingdings" w:hAnsi="Wingdings" w:hint="default"/>
+        <w:sz w:val="20"/>
+      </w:rPr>
+    </w:lvl>
+    <w:lvl w:ilvl="8" w:tentative="1">
+      <w:start w:val="1"/>
+      <w:numFmt w:val="bullet"/>
+      <w:lvlText w:val=""/>
+      <w:lvlJc w:val="left"/>
+      <w:pPr>
+        <w:tabs>
+          <w:tab w:val="num" w:pos="6480"/>
+        </w:tabs>
+        <w:ind w:left="6480" w:hanging="360"/>
+      </w:pPr>
+      <w:rPr>
+        <w:rFonts w:ascii="Wingdings" w:hAnsi="Wingdings" w:hint="default"/>
+        <w:sz w:val="20"/>
+      </w:rPr>
+    </w:lvl>
+  </w:abstractNum>
+  <w:abstractNum w:abstractNumId="6" w15:restartNumberingAfterBreak="0">
+    <w:nsid w:val="46655F7D"/>
+    <w:multiLevelType w:val="multilevel"/>
+    <w:tmpl w:val="F95AB90E"/>
+    <w:lvl w:ilvl="0">
+      <w:start w:val="1"/>
+      <w:numFmt w:val="bullet"/>
+      <w:lvlText w:val=""/>
+      <w:lvlJc w:val="left"/>
+      <w:pPr>
+        <w:tabs>
+          <w:tab w:val="num" w:pos="720"/>
+        </w:tabs>
+        <w:ind w:left="720" w:hanging="360"/>
+      </w:pPr>
+      <w:rPr>
+        <w:rFonts w:ascii="Symbol" w:hAnsi="Symbol" w:hint="default"/>
+        <w:sz w:val="20"/>
+      </w:rPr>
+    </w:lvl>
+    <w:lvl w:ilvl="1" w:tentative="1">
+      <w:start w:val="1"/>
+      <w:numFmt w:val="bullet"/>
+      <w:lvlText w:val="o"/>
+      <w:lvlJc w:val="left"/>
+      <w:pPr>
+        <w:tabs>
+          <w:tab w:val="num" w:pos="1440"/>
+        </w:tabs>
+        <w:ind w:left="1440" w:hanging="360"/>
+      </w:pPr>
+      <w:rPr>
+        <w:rFonts w:ascii="Courier New" w:hAnsi="Courier New" w:hint="default"/>
+        <w:sz w:val="20"/>
+      </w:rPr>
+    </w:lvl>
+    <w:lvl w:ilvl="2" w:tentative="1">
+      <w:start w:val="1"/>
+      <w:numFmt w:val="bullet"/>
+      <w:lvlText w:val=""/>
+      <w:lvlJc w:val="left"/>
+      <w:pPr>
+        <w:tabs>
+          <w:tab w:val="num" w:pos="2160"/>
+        </w:tabs>
+        <w:ind w:left="2160" w:hanging="360"/>
+      </w:pPr>
+      <w:rPr>
+        <w:rFonts w:ascii="Wingdings" w:hAnsi="Wingdings" w:hint="default"/>
+        <w:sz w:val="20"/>
+      </w:rPr>
+    </w:lvl>
+    <w:lvl w:ilvl="3" w:tentative="1">
+      <w:start w:val="1"/>
+      <w:numFmt w:val="bullet"/>
+      <w:lvlText w:val=""/>
+      <w:lvlJc w:val="left"/>
+      <w:pPr>
+        <w:tabs>
+          <w:tab w:val="num" w:pos="2880"/>
+        </w:tabs>
+        <w:ind w:left="2880" w:hanging="360"/>
+      </w:pPr>
+      <w:rPr>
+        <w:rFonts w:ascii="Wingdings" w:hAnsi="Wingdings" w:hint="default"/>
+        <w:sz w:val="20"/>
+      </w:rPr>
+    </w:lvl>
+    <w:lvl w:ilvl="4" w:tentative="1">
+      <w:start w:val="1"/>
+      <w:numFmt w:val="bullet"/>
+      <w:lvlText w:val=""/>
+      <w:lvlJc w:val="left"/>
+      <w:pPr>
+        <w:tabs>
+          <w:tab w:val="num" w:pos="3600"/>
+        </w:tabs>
+        <w:ind w:left="3600" w:hanging="360"/>
+      </w:pPr>
+      <w:rPr>
+        <w:rFonts w:ascii="Wingdings" w:hAnsi="Wingdings" w:hint="default"/>
+        <w:sz w:val="20"/>
+      </w:rPr>
+    </w:lvl>
+    <w:lvl w:ilvl="5" w:tentative="1">
+      <w:start w:val="1"/>
+      <w:numFmt w:val="bullet"/>
+      <w:lvlText w:val=""/>
+      <w:lvlJc w:val="left"/>
+      <w:pPr>
+        <w:tabs>
+          <w:tab w:val="num" w:pos="4320"/>
+        </w:tabs>
+        <w:ind w:left="4320" w:hanging="360"/>
+      </w:pPr>
+      <w:rPr>
+        <w:rFonts w:ascii="Wingdings" w:hAnsi="Wingdings" w:hint="default"/>
+        <w:sz w:val="20"/>
+      </w:rPr>
+    </w:lvl>
+    <w:lvl w:ilvl="6" w:tentative="1">
+      <w:start w:val="1"/>
+      <w:numFmt w:val="bullet"/>
+      <w:lvlText w:val=""/>
+      <w:lvlJc w:val="left"/>
+      <w:pPr>
+        <w:tabs>
+          <w:tab w:val="num" w:pos="5040"/>
+        </w:tabs>
+        <w:ind w:left="5040" w:hanging="360"/>
+      </w:pPr>
+      <w:rPr>
+        <w:rFonts w:ascii="Wingdings" w:hAnsi="Wingdings" w:hint="default"/>
+        <w:sz w:val="20"/>
+      </w:rPr>
+    </w:lvl>
+    <w:lvl w:ilvl="7" w:tentative="1">
+      <w:start w:val="1"/>
+      <w:numFmt w:val="bullet"/>
+      <w:lvlText w:val=""/>
+      <w:lvlJc w:val="left"/>
+      <w:pPr>
+        <w:tabs>
+          <w:tab w:val="num" w:pos="5760"/>
+        </w:tabs>
+        <w:ind w:left="5760" w:hanging="360"/>
+      </w:pPr>
+      <w:rPr>
+        <w:rFonts w:ascii="Wingdings" w:hAnsi="Wingdings" w:hint="default"/>
+        <w:sz w:val="20"/>
+      </w:rPr>
+    </w:lvl>
+    <w:lvl w:ilvl="8" w:tentative="1">
+      <w:start w:val="1"/>
+      <w:numFmt w:val="bullet"/>
+      <w:lvlText w:val=""/>
+      <w:lvlJc w:val="left"/>
+      <w:pPr>
+        <w:tabs>
+          <w:tab w:val="num" w:pos="6480"/>
+        </w:tabs>
+        <w:ind w:left="6480" w:hanging="360"/>
+      </w:pPr>
+      <w:rPr>
+        <w:rFonts w:ascii="Wingdings" w:hAnsi="Wingdings" w:hint="default"/>
+        <w:sz w:val="20"/>
+      </w:rPr>
+    </w:lvl>
+  </w:abstractNum>
+  <w:abstractNum w:abstractNumId="7" w15:restartNumberingAfterBreak="0">
+    <w:nsid w:val="4F1E7FC0"/>
+    <w:multiLevelType w:val="multilevel"/>
+    <w:tmpl w:val="929ACA54"/>
+    <w:lvl w:ilvl="0">
+      <w:start w:val="1"/>
+      <w:numFmt w:val="bullet"/>
+      <w:lvlText w:val=""/>
+      <w:lvlJc w:val="left"/>
+      <w:pPr>
+        <w:tabs>
+          <w:tab w:val="num" w:pos="720"/>
+        </w:tabs>
+        <w:ind w:left="720" w:hanging="360"/>
+      </w:pPr>
+      <w:rPr>
+        <w:rFonts w:ascii="Symbol" w:hAnsi="Symbol" w:hint="default"/>
+        <w:sz w:val="20"/>
+      </w:rPr>
+    </w:lvl>
+    <w:lvl w:ilvl="1" w:tentative="1">
+      <w:start w:val="1"/>
+      <w:numFmt w:val="bullet"/>
+      <w:lvlText w:val="o"/>
+      <w:lvlJc w:val="left"/>
+      <w:pPr>
+        <w:tabs>
+          <w:tab w:val="num" w:pos="1440"/>
+        </w:tabs>
+        <w:ind w:left="1440" w:hanging="360"/>
+      </w:pPr>
+      <w:rPr>
+        <w:rFonts w:ascii="Courier New" w:hAnsi="Courier New" w:hint="default"/>
+        <w:sz w:val="20"/>
+      </w:rPr>
+    </w:lvl>
+    <w:lvl w:ilvl="2" w:tentative="1">
+      <w:start w:val="1"/>
+      <w:numFmt w:val="bullet"/>
+      <w:lvlText w:val=""/>
+      <w:lvlJc w:val="left"/>
+      <w:pPr>
+        <w:tabs>
+          <w:tab w:val="num" w:pos="2160"/>
+        </w:tabs>
+        <w:ind w:left="2160" w:hanging="360"/>
+      </w:pPr>
+      <w:rPr>
+        <w:rFonts w:ascii="Wingdings" w:hAnsi="Wingdings" w:hint="default"/>
+        <w:sz w:val="20"/>
+      </w:rPr>
+    </w:lvl>
+    <w:lvl w:ilvl="3" w:tentative="1">
+      <w:start w:val="1"/>
+      <w:numFmt w:val="bullet"/>
+      <w:lvlText w:val=""/>
+      <w:lvlJc w:val="left"/>
+      <w:pPr>
+        <w:tabs>
+          <w:tab w:val="num" w:pos="2880"/>
+        </w:tabs>
+        <w:ind w:left="2880" w:hanging="360"/>
+      </w:pPr>
+      <w:rPr>
+        <w:rFonts w:ascii="Wingdings" w:hAnsi="Wingdings" w:hint="default"/>
+        <w:sz w:val="20"/>
+      </w:rPr>
+    </w:lvl>
+    <w:lvl w:ilvl="4" w:tentative="1">
+      <w:start w:val="1"/>
+      <w:numFmt w:val="bullet"/>
+      <w:lvlText w:val=""/>
+      <w:lvlJc w:val="left"/>
+      <w:pPr>
+        <w:tabs>
+          <w:tab w:val="num" w:pos="3600"/>
+        </w:tabs>
+        <w:ind w:left="3600" w:hanging="360"/>
+      </w:pPr>
+      <w:rPr>
+        <w:rFonts w:ascii="Wingdings" w:hAnsi="Wingdings" w:hint="default"/>
+        <w:sz w:val="20"/>
+      </w:rPr>
+    </w:lvl>
+    <w:lvl w:ilvl="5" w:tentative="1">
+      <w:start w:val="1"/>
+      <w:numFmt w:val="bullet"/>
+      <w:lvlText w:val=""/>
+      <w:lvlJc w:val="left"/>
+      <w:pPr>
+        <w:tabs>
+          <w:tab w:val="num" w:pos="4320"/>
+        </w:tabs>
+        <w:ind w:left="4320" w:hanging="360"/>
+      </w:pPr>
+      <w:rPr>
+        <w:rFonts w:ascii="Wingdings" w:hAnsi="Wingdings" w:hint="default"/>
+        <w:sz w:val="20"/>
+      </w:rPr>
+    </w:lvl>
+    <w:lvl w:ilvl="6" w:tentative="1">
+      <w:start w:val="1"/>
+      <w:numFmt w:val="bullet"/>
+      <w:lvlText w:val=""/>
+      <w:lvlJc w:val="left"/>
+      <w:pPr>
+        <w:tabs>
+          <w:tab w:val="num" w:pos="5040"/>
+        </w:tabs>
+        <w:ind w:left="5040" w:hanging="360"/>
+      </w:pPr>
+      <w:rPr>
+        <w:rFonts w:ascii="Wingdings" w:hAnsi="Wingdings" w:hint="default"/>
+        <w:sz w:val="20"/>
+      </w:rPr>
+    </w:lvl>
+    <w:lvl w:ilvl="7" w:tentative="1">
+      <w:start w:val="1"/>
+      <w:numFmt w:val="bullet"/>
+      <w:lvlText w:val=""/>
+      <w:lvlJc w:val="left"/>
+      <w:pPr>
+        <w:tabs>
+          <w:tab w:val="num" w:pos="5760"/>
+        </w:tabs>
+        <w:ind w:left="5760" w:hanging="360"/>
+      </w:pPr>
+      <w:rPr>
+        <w:rFonts w:ascii="Wingdings" w:hAnsi="Wingdings" w:hint="default"/>
+        <w:sz w:val="20"/>
+      </w:rPr>
+    </w:lvl>
+    <w:lvl w:ilvl="8" w:tentative="1">
+      <w:start w:val="1"/>
+      <w:numFmt w:val="bullet"/>
+      <w:lvlText w:val=""/>
+      <w:lvlJc w:val="left"/>
+      <w:pPr>
+        <w:tabs>
+          <w:tab w:val="num" w:pos="6480"/>
+        </w:tabs>
+        <w:ind w:left="6480" w:hanging="360"/>
+      </w:pPr>
+      <w:rPr>
+        <w:rFonts w:ascii="Wingdings" w:hAnsi="Wingdings" w:hint="default"/>
+        <w:sz w:val="20"/>
+      </w:rPr>
+    </w:lvl>
+  </w:abstractNum>
+  <w:abstractNum w:abstractNumId="8" w15:restartNumberingAfterBreak="0">
+    <w:nsid w:val="4F801D97"/>
+    <w:multiLevelType w:val="multilevel"/>
+    <w:tmpl w:val="BA666B68"/>
+    <w:lvl w:ilvl="0">
+      <w:start w:val="1"/>
+      <w:numFmt w:val="bullet"/>
+      <w:lvlText w:val=""/>
+      <w:lvlJc w:val="left"/>
+      <w:pPr>
+        <w:tabs>
+          <w:tab w:val="num" w:pos="720"/>
+        </w:tabs>
+        <w:ind w:left="720" w:hanging="360"/>
+      </w:pPr>
+      <w:rPr>
+        <w:rFonts w:ascii="Symbol" w:hAnsi="Symbol" w:hint="default"/>
+        <w:sz w:val="20"/>
+      </w:rPr>
+    </w:lvl>
+    <w:lvl w:ilvl="1" w:tentative="1">
+      <w:start w:val="1"/>
+      <w:numFmt w:val="bullet"/>
+      <w:lvlText w:val="o"/>
+      <w:lvlJc w:val="left"/>
+      <w:pPr>
+        <w:tabs>
+          <w:tab w:val="num" w:pos="1440"/>
+        </w:tabs>
+        <w:ind w:left="1440" w:hanging="360"/>
+      </w:pPr>
+      <w:rPr>
+        <w:rFonts w:ascii="Courier New" w:hAnsi="Courier New" w:hint="default"/>
+        <w:sz w:val="20"/>
+      </w:rPr>
+    </w:lvl>
+    <w:lvl w:ilvl="2" w:tentative="1">
+      <w:start w:val="1"/>
+      <w:numFmt w:val="bullet"/>
+      <w:lvlText w:val=""/>
+      <w:lvlJc w:val="left"/>
+      <w:pPr>
+        <w:tabs>
+          <w:tab w:val="num" w:pos="2160"/>
+        </w:tabs>
+        <w:ind w:left="2160" w:hanging="360"/>
+      </w:pPr>
+      <w:rPr>
+        <w:rFonts w:ascii="Wingdings" w:hAnsi="Wingdings" w:hint="default"/>
+        <w:sz w:val="20"/>
+      </w:rPr>
+    </w:lvl>
+    <w:lvl w:ilvl="3" w:tentative="1">
+      <w:start w:val="1"/>
+      <w:numFmt w:val="bullet"/>
+      <w:lvlText w:val=""/>
+      <w:lvlJc w:val="left"/>
+      <w:pPr>
+        <w:tabs>
+          <w:tab w:val="num" w:pos="2880"/>
+        </w:tabs>
+        <w:ind w:left="2880" w:hanging="360"/>
+      </w:pPr>
+      <w:rPr>
+        <w:rFonts w:ascii="Wingdings" w:hAnsi="Wingdings" w:hint="default"/>
+        <w:sz w:val="20"/>
+      </w:rPr>
+    </w:lvl>
+    <w:lvl w:ilvl="4" w:tentative="1">
+      <w:start w:val="1"/>
+      <w:numFmt w:val="bullet"/>
+      <w:lvlText w:val=""/>
+      <w:lvlJc w:val="left"/>
+      <w:pPr>
+        <w:tabs>
+          <w:tab w:val="num" w:pos="3600"/>
+        </w:tabs>
+        <w:ind w:left="3600" w:hanging="360"/>
+      </w:pPr>
+      <w:rPr>
+        <w:rFonts w:ascii="Wingdings" w:hAnsi="Wingdings" w:hint="default"/>
+        <w:sz w:val="20"/>
+      </w:rPr>
+    </w:lvl>
+    <w:lvl w:ilvl="5" w:tentative="1">
+      <w:start w:val="1"/>
+      <w:numFmt w:val="bullet"/>
+      <w:lvlText w:val=""/>
+      <w:lvlJc w:val="left"/>
+      <w:pPr>
+        <w:tabs>
+          <w:tab w:val="num" w:pos="4320"/>
+        </w:tabs>
+        <w:ind w:left="4320" w:hanging="360"/>
+      </w:pPr>
+      <w:rPr>
+        <w:rFonts w:ascii="Wingdings" w:hAnsi="Wingdings" w:hint="default"/>
+        <w:sz w:val="20"/>
+      </w:rPr>
+    </w:lvl>
+    <w:lvl w:ilvl="6" w:tentative="1">
+      <w:start w:val="1"/>
+      <w:numFmt w:val="bullet"/>
+      <w:lvlText w:val=""/>
+      <w:lvlJc w:val="left"/>
+      <w:pPr>
+        <w:tabs>
+          <w:tab w:val="num" w:pos="5040"/>
+        </w:tabs>
+        <w:ind w:left="5040" w:hanging="360"/>
+      </w:pPr>
+      <w:rPr>
+        <w:rFonts w:ascii="Wingdings" w:hAnsi="Wingdings" w:hint="default"/>
+        <w:sz w:val="20"/>
+      </w:rPr>
+    </w:lvl>
+    <w:lvl w:ilvl="7" w:tentative="1">
+      <w:start w:val="1"/>
+      <w:numFmt w:val="bullet"/>
+      <w:lvlText w:val=""/>
+      <w:lvlJc w:val="left"/>
+      <w:pPr>
+        <w:tabs>
+          <w:tab w:val="num" w:pos="5760"/>
+        </w:tabs>
+        <w:ind w:left="5760" w:hanging="360"/>
+      </w:pPr>
+      <w:rPr>
+        <w:rFonts w:ascii="Wingdings" w:hAnsi="Wingdings" w:hint="default"/>
+        <w:sz w:val="20"/>
+      </w:rPr>
+    </w:lvl>
+    <w:lvl w:ilvl="8" w:tentative="1">
+      <w:start w:val="1"/>
+      <w:numFmt w:val="bullet"/>
+      <w:lvlText w:val=""/>
+      <w:lvlJc w:val="left"/>
+      <w:pPr>
+        <w:tabs>
+          <w:tab w:val="num" w:pos="6480"/>
+        </w:tabs>
+        <w:ind w:left="6480" w:hanging="360"/>
+      </w:pPr>
+      <w:rPr>
+        <w:rFonts w:ascii="Wingdings" w:hAnsi="Wingdings" w:hint="default"/>
+        <w:sz w:val="20"/>
+      </w:rPr>
+    </w:lvl>
+  </w:abstractNum>
+  <w:abstractNum w:abstractNumId="9" w15:restartNumberingAfterBreak="0">
     <w:nsid w:val="50087F4E"/>
     <w:multiLevelType w:val="multilevel"/>
     <w:tmpl w:val="31B68324"/>
@@ -5150,7 +7944,454 @@
       </w:rPr>
     </w:lvl>
   </w:abstractNum>
-  <w:abstractNum w:abstractNumId="3" w15:restartNumberingAfterBreak="0">
+  <w:abstractNum w:abstractNumId="10" w15:restartNumberingAfterBreak="0">
+    <w:nsid w:val="52747F43"/>
+    <w:multiLevelType w:val="multilevel"/>
+    <w:tmpl w:val="14682062"/>
+    <w:lvl w:ilvl="0">
+      <w:start w:val="1"/>
+      <w:numFmt w:val="bullet"/>
+      <w:lvlText w:val=""/>
+      <w:lvlJc w:val="left"/>
+      <w:pPr>
+        <w:tabs>
+          <w:tab w:val="num" w:pos="720"/>
+        </w:tabs>
+        <w:ind w:left="720" w:hanging="360"/>
+      </w:pPr>
+      <w:rPr>
+        <w:rFonts w:ascii="Symbol" w:hAnsi="Symbol" w:hint="default"/>
+        <w:sz w:val="20"/>
+      </w:rPr>
+    </w:lvl>
+    <w:lvl w:ilvl="1" w:tentative="1">
+      <w:start w:val="1"/>
+      <w:numFmt w:val="bullet"/>
+      <w:lvlText w:val="o"/>
+      <w:lvlJc w:val="left"/>
+      <w:pPr>
+        <w:tabs>
+          <w:tab w:val="num" w:pos="1440"/>
+        </w:tabs>
+        <w:ind w:left="1440" w:hanging="360"/>
+      </w:pPr>
+      <w:rPr>
+        <w:rFonts w:ascii="Courier New" w:hAnsi="Courier New" w:hint="default"/>
+        <w:sz w:val="20"/>
+      </w:rPr>
+    </w:lvl>
+    <w:lvl w:ilvl="2" w:tentative="1">
+      <w:start w:val="1"/>
+      <w:numFmt w:val="bullet"/>
+      <w:lvlText w:val=""/>
+      <w:lvlJc w:val="left"/>
+      <w:pPr>
+        <w:tabs>
+          <w:tab w:val="num" w:pos="2160"/>
+        </w:tabs>
+        <w:ind w:left="2160" w:hanging="360"/>
+      </w:pPr>
+      <w:rPr>
+        <w:rFonts w:ascii="Wingdings" w:hAnsi="Wingdings" w:hint="default"/>
+        <w:sz w:val="20"/>
+      </w:rPr>
+    </w:lvl>
+    <w:lvl w:ilvl="3" w:tentative="1">
+      <w:start w:val="1"/>
+      <w:numFmt w:val="bullet"/>
+      <w:lvlText w:val=""/>
+      <w:lvlJc w:val="left"/>
+      <w:pPr>
+        <w:tabs>
+          <w:tab w:val="num" w:pos="2880"/>
+        </w:tabs>
+        <w:ind w:left="2880" w:hanging="360"/>
+      </w:pPr>
+      <w:rPr>
+        <w:rFonts w:ascii="Wingdings" w:hAnsi="Wingdings" w:hint="default"/>
+        <w:sz w:val="20"/>
+      </w:rPr>
+    </w:lvl>
+    <w:lvl w:ilvl="4" w:tentative="1">
+      <w:start w:val="1"/>
+      <w:numFmt w:val="bullet"/>
+      <w:lvlText w:val=""/>
+      <w:lvlJc w:val="left"/>
+      <w:pPr>
+        <w:tabs>
+          <w:tab w:val="num" w:pos="3600"/>
+        </w:tabs>
+        <w:ind w:left="3600" w:hanging="360"/>
+      </w:pPr>
+      <w:rPr>
+        <w:rFonts w:ascii="Wingdings" w:hAnsi="Wingdings" w:hint="default"/>
+        <w:sz w:val="20"/>
+      </w:rPr>
+    </w:lvl>
+    <w:lvl w:ilvl="5" w:tentative="1">
+      <w:start w:val="1"/>
+      <w:numFmt w:val="bullet"/>
+      <w:lvlText w:val=""/>
+      <w:lvlJc w:val="left"/>
+      <w:pPr>
+        <w:tabs>
+          <w:tab w:val="num" w:pos="4320"/>
+        </w:tabs>
+        <w:ind w:left="4320" w:hanging="360"/>
+      </w:pPr>
+      <w:rPr>
+        <w:rFonts w:ascii="Wingdings" w:hAnsi="Wingdings" w:hint="default"/>
+        <w:sz w:val="20"/>
+      </w:rPr>
+    </w:lvl>
+    <w:lvl w:ilvl="6" w:tentative="1">
+      <w:start w:val="1"/>
+      <w:numFmt w:val="bullet"/>
+      <w:lvlText w:val=""/>
+      <w:lvlJc w:val="left"/>
+      <w:pPr>
+        <w:tabs>
+          <w:tab w:val="num" w:pos="5040"/>
+        </w:tabs>
+        <w:ind w:left="5040" w:hanging="360"/>
+      </w:pPr>
+      <w:rPr>
+        <w:rFonts w:ascii="Wingdings" w:hAnsi="Wingdings" w:hint="default"/>
+        <w:sz w:val="20"/>
+      </w:rPr>
+    </w:lvl>
+    <w:lvl w:ilvl="7" w:tentative="1">
+      <w:start w:val="1"/>
+      <w:numFmt w:val="bullet"/>
+      <w:lvlText w:val=""/>
+      <w:lvlJc w:val="left"/>
+      <w:pPr>
+        <w:tabs>
+          <w:tab w:val="num" w:pos="5760"/>
+        </w:tabs>
+        <w:ind w:left="5760" w:hanging="360"/>
+      </w:pPr>
+      <w:rPr>
+        <w:rFonts w:ascii="Wingdings" w:hAnsi="Wingdings" w:hint="default"/>
+        <w:sz w:val="20"/>
+      </w:rPr>
+    </w:lvl>
+    <w:lvl w:ilvl="8" w:tentative="1">
+      <w:start w:val="1"/>
+      <w:numFmt w:val="bullet"/>
+      <w:lvlText w:val=""/>
+      <w:lvlJc w:val="left"/>
+      <w:pPr>
+        <w:tabs>
+          <w:tab w:val="num" w:pos="6480"/>
+        </w:tabs>
+        <w:ind w:left="6480" w:hanging="360"/>
+      </w:pPr>
+      <w:rPr>
+        <w:rFonts w:ascii="Wingdings" w:hAnsi="Wingdings" w:hint="default"/>
+        <w:sz w:val="20"/>
+      </w:rPr>
+    </w:lvl>
+  </w:abstractNum>
+  <w:abstractNum w:abstractNumId="11" w15:restartNumberingAfterBreak="0">
+    <w:nsid w:val="53D670D9"/>
+    <w:multiLevelType w:val="multilevel"/>
+    <w:tmpl w:val="127A3E72"/>
+    <w:lvl w:ilvl="0">
+      <w:start w:val="1"/>
+      <w:numFmt w:val="bullet"/>
+      <w:lvlText w:val=""/>
+      <w:lvlJc w:val="left"/>
+      <w:pPr>
+        <w:tabs>
+          <w:tab w:val="num" w:pos="720"/>
+        </w:tabs>
+        <w:ind w:left="720" w:hanging="360"/>
+      </w:pPr>
+      <w:rPr>
+        <w:rFonts w:ascii="Symbol" w:hAnsi="Symbol" w:hint="default"/>
+        <w:sz w:val="20"/>
+      </w:rPr>
+    </w:lvl>
+    <w:lvl w:ilvl="1" w:tentative="1">
+      <w:start w:val="1"/>
+      <w:numFmt w:val="bullet"/>
+      <w:lvlText w:val="o"/>
+      <w:lvlJc w:val="left"/>
+      <w:pPr>
+        <w:tabs>
+          <w:tab w:val="num" w:pos="1440"/>
+        </w:tabs>
+        <w:ind w:left="1440" w:hanging="360"/>
+      </w:pPr>
+      <w:rPr>
+        <w:rFonts w:ascii="Courier New" w:hAnsi="Courier New" w:hint="default"/>
+        <w:sz w:val="20"/>
+      </w:rPr>
+    </w:lvl>
+    <w:lvl w:ilvl="2" w:tentative="1">
+      <w:start w:val="1"/>
+      <w:numFmt w:val="bullet"/>
+      <w:lvlText w:val=""/>
+      <w:lvlJc w:val="left"/>
+      <w:pPr>
+        <w:tabs>
+          <w:tab w:val="num" w:pos="2160"/>
+        </w:tabs>
+        <w:ind w:left="2160" w:hanging="360"/>
+      </w:pPr>
+      <w:rPr>
+        <w:rFonts w:ascii="Wingdings" w:hAnsi="Wingdings" w:hint="default"/>
+        <w:sz w:val="20"/>
+      </w:rPr>
+    </w:lvl>
+    <w:lvl w:ilvl="3" w:tentative="1">
+      <w:start w:val="1"/>
+      <w:numFmt w:val="bullet"/>
+      <w:lvlText w:val=""/>
+      <w:lvlJc w:val="left"/>
+      <w:pPr>
+        <w:tabs>
+          <w:tab w:val="num" w:pos="2880"/>
+        </w:tabs>
+        <w:ind w:left="2880" w:hanging="360"/>
+      </w:pPr>
+      <w:rPr>
+        <w:rFonts w:ascii="Wingdings" w:hAnsi="Wingdings" w:hint="default"/>
+        <w:sz w:val="20"/>
+      </w:rPr>
+    </w:lvl>
+    <w:lvl w:ilvl="4" w:tentative="1">
+      <w:start w:val="1"/>
+      <w:numFmt w:val="bullet"/>
+      <w:lvlText w:val=""/>
+      <w:lvlJc w:val="left"/>
+      <w:pPr>
+        <w:tabs>
+          <w:tab w:val="num" w:pos="3600"/>
+        </w:tabs>
+        <w:ind w:left="3600" w:hanging="360"/>
+      </w:pPr>
+      <w:rPr>
+        <w:rFonts w:ascii="Wingdings" w:hAnsi="Wingdings" w:hint="default"/>
+        <w:sz w:val="20"/>
+      </w:rPr>
+    </w:lvl>
+    <w:lvl w:ilvl="5" w:tentative="1">
+      <w:start w:val="1"/>
+      <w:numFmt w:val="bullet"/>
+      <w:lvlText w:val=""/>
+      <w:lvlJc w:val="left"/>
+      <w:pPr>
+        <w:tabs>
+          <w:tab w:val="num" w:pos="4320"/>
+        </w:tabs>
+        <w:ind w:left="4320" w:hanging="360"/>
+      </w:pPr>
+      <w:rPr>
+        <w:rFonts w:ascii="Wingdings" w:hAnsi="Wingdings" w:hint="default"/>
+        <w:sz w:val="20"/>
+      </w:rPr>
+    </w:lvl>
+    <w:lvl w:ilvl="6" w:tentative="1">
+      <w:start w:val="1"/>
+      <w:numFmt w:val="bullet"/>
+      <w:lvlText w:val=""/>
+      <w:lvlJc w:val="left"/>
+      <w:pPr>
+        <w:tabs>
+          <w:tab w:val="num" w:pos="5040"/>
+        </w:tabs>
+        <w:ind w:left="5040" w:hanging="360"/>
+      </w:pPr>
+      <w:rPr>
+        <w:rFonts w:ascii="Wingdings" w:hAnsi="Wingdings" w:hint="default"/>
+        <w:sz w:val="20"/>
+      </w:rPr>
+    </w:lvl>
+    <w:lvl w:ilvl="7" w:tentative="1">
+      <w:start w:val="1"/>
+      <w:numFmt w:val="bullet"/>
+      <w:lvlText w:val=""/>
+      <w:lvlJc w:val="left"/>
+      <w:pPr>
+        <w:tabs>
+          <w:tab w:val="num" w:pos="5760"/>
+        </w:tabs>
+        <w:ind w:left="5760" w:hanging="360"/>
+      </w:pPr>
+      <w:rPr>
+        <w:rFonts w:ascii="Wingdings" w:hAnsi="Wingdings" w:hint="default"/>
+        <w:sz w:val="20"/>
+      </w:rPr>
+    </w:lvl>
+    <w:lvl w:ilvl="8" w:tentative="1">
+      <w:start w:val="1"/>
+      <w:numFmt w:val="bullet"/>
+      <w:lvlText w:val=""/>
+      <w:lvlJc w:val="left"/>
+      <w:pPr>
+        <w:tabs>
+          <w:tab w:val="num" w:pos="6480"/>
+        </w:tabs>
+        <w:ind w:left="6480" w:hanging="360"/>
+      </w:pPr>
+      <w:rPr>
+        <w:rFonts w:ascii="Wingdings" w:hAnsi="Wingdings" w:hint="default"/>
+        <w:sz w:val="20"/>
+      </w:rPr>
+    </w:lvl>
+  </w:abstractNum>
+  <w:abstractNum w:abstractNumId="12" w15:restartNumberingAfterBreak="0">
+    <w:nsid w:val="541B4CE1"/>
+    <w:multiLevelType w:val="multilevel"/>
+    <w:tmpl w:val="1E1EE53C"/>
+    <w:lvl w:ilvl="0">
+      <w:start w:val="1"/>
+      <w:numFmt w:val="bullet"/>
+      <w:lvlText w:val=""/>
+      <w:lvlJc w:val="left"/>
+      <w:pPr>
+        <w:tabs>
+          <w:tab w:val="num" w:pos="720"/>
+        </w:tabs>
+        <w:ind w:left="720" w:hanging="360"/>
+      </w:pPr>
+      <w:rPr>
+        <w:rFonts w:ascii="Symbol" w:hAnsi="Symbol" w:hint="default"/>
+        <w:sz w:val="20"/>
+      </w:rPr>
+    </w:lvl>
+    <w:lvl w:ilvl="1" w:tentative="1">
+      <w:start w:val="1"/>
+      <w:numFmt w:val="bullet"/>
+      <w:lvlText w:val="o"/>
+      <w:lvlJc w:val="left"/>
+      <w:pPr>
+        <w:tabs>
+          <w:tab w:val="num" w:pos="1440"/>
+        </w:tabs>
+        <w:ind w:left="1440" w:hanging="360"/>
+      </w:pPr>
+      <w:rPr>
+        <w:rFonts w:ascii="Courier New" w:hAnsi="Courier New" w:hint="default"/>
+        <w:sz w:val="20"/>
+      </w:rPr>
+    </w:lvl>
+    <w:lvl w:ilvl="2" w:tentative="1">
+      <w:start w:val="1"/>
+      <w:numFmt w:val="bullet"/>
+      <w:lvlText w:val=""/>
+      <w:lvlJc w:val="left"/>
+      <w:pPr>
+        <w:tabs>
+          <w:tab w:val="num" w:pos="2160"/>
+        </w:tabs>
+        <w:ind w:left="2160" w:hanging="360"/>
+      </w:pPr>
+      <w:rPr>
+        <w:rFonts w:ascii="Wingdings" w:hAnsi="Wingdings" w:hint="default"/>
+        <w:sz w:val="20"/>
+      </w:rPr>
+    </w:lvl>
+    <w:lvl w:ilvl="3" w:tentative="1">
+      <w:start w:val="1"/>
+      <w:numFmt w:val="bullet"/>
+      <w:lvlText w:val=""/>
+      <w:lvlJc w:val="left"/>
+      <w:pPr>
+        <w:tabs>
+          <w:tab w:val="num" w:pos="2880"/>
+        </w:tabs>
+        <w:ind w:left="2880" w:hanging="360"/>
+      </w:pPr>
+      <w:rPr>
+        <w:rFonts w:ascii="Wingdings" w:hAnsi="Wingdings" w:hint="default"/>
+        <w:sz w:val="20"/>
+      </w:rPr>
+    </w:lvl>
+    <w:lvl w:ilvl="4" w:tentative="1">
+      <w:start w:val="1"/>
+      <w:numFmt w:val="bullet"/>
+      <w:lvlText w:val=""/>
+      <w:lvlJc w:val="left"/>
+      <w:pPr>
+        <w:tabs>
+          <w:tab w:val="num" w:pos="3600"/>
+        </w:tabs>
+        <w:ind w:left="3600" w:hanging="360"/>
+      </w:pPr>
+      <w:rPr>
+        <w:rFonts w:ascii="Wingdings" w:hAnsi="Wingdings" w:hint="default"/>
+        <w:sz w:val="20"/>
+      </w:rPr>
+    </w:lvl>
+    <w:lvl w:ilvl="5" w:tentative="1">
+      <w:start w:val="1"/>
+      <w:numFmt w:val="bullet"/>
+      <w:lvlText w:val=""/>
+      <w:lvlJc w:val="left"/>
+      <w:pPr>
+        <w:tabs>
+          <w:tab w:val="num" w:pos="4320"/>
+        </w:tabs>
+        <w:ind w:left="4320" w:hanging="360"/>
+      </w:pPr>
+      <w:rPr>
+        <w:rFonts w:ascii="Wingdings" w:hAnsi="Wingdings" w:hint="default"/>
+        <w:sz w:val="20"/>
+      </w:rPr>
+    </w:lvl>
+    <w:lvl w:ilvl="6" w:tentative="1">
+      <w:start w:val="1"/>
+      <w:numFmt w:val="bullet"/>
+      <w:lvlText w:val=""/>
+      <w:lvlJc w:val="left"/>
+      <w:pPr>
+        <w:tabs>
+          <w:tab w:val="num" w:pos="5040"/>
+        </w:tabs>
+        <w:ind w:left="5040" w:hanging="360"/>
+      </w:pPr>
+      <w:rPr>
+        <w:rFonts w:ascii="Wingdings" w:hAnsi="Wingdings" w:hint="default"/>
+        <w:sz w:val="20"/>
+      </w:rPr>
+    </w:lvl>
+    <w:lvl w:ilvl="7" w:tentative="1">
+      <w:start w:val="1"/>
+      <w:numFmt w:val="bullet"/>
+      <w:lvlText w:val=""/>
+      <w:lvlJc w:val="left"/>
+      <w:pPr>
+        <w:tabs>
+          <w:tab w:val="num" w:pos="5760"/>
+        </w:tabs>
+        <w:ind w:left="5760" w:hanging="360"/>
+      </w:pPr>
+      <w:rPr>
+        <w:rFonts w:ascii="Wingdings" w:hAnsi="Wingdings" w:hint="default"/>
+        <w:sz w:val="20"/>
+      </w:rPr>
+    </w:lvl>
+    <w:lvl w:ilvl="8" w:tentative="1">
+      <w:start w:val="1"/>
+      <w:numFmt w:val="bullet"/>
+      <w:lvlText w:val=""/>
+      <w:lvlJc w:val="left"/>
+      <w:pPr>
+        <w:tabs>
+          <w:tab w:val="num" w:pos="6480"/>
+        </w:tabs>
+        <w:ind w:left="6480" w:hanging="360"/>
+      </w:pPr>
+      <w:rPr>
+        <w:rFonts w:ascii="Wingdings" w:hAnsi="Wingdings" w:hint="default"/>
+        <w:sz w:val="20"/>
+      </w:rPr>
+    </w:lvl>
+  </w:abstractNum>
+  <w:abstractNum w:abstractNumId="13" w15:restartNumberingAfterBreak="0">
     <w:nsid w:val="57EB10AC"/>
     <w:multiLevelType w:val="multilevel"/>
     <w:tmpl w:val="7CF6513A"/>
@@ -5299,7 +8540,7 @@
       </w:rPr>
     </w:lvl>
   </w:abstractNum>
-  <w:abstractNum w:abstractNumId="4" w15:restartNumberingAfterBreak="0">
+  <w:abstractNum w:abstractNumId="14" w15:restartNumberingAfterBreak="0">
     <w:nsid w:val="58840408"/>
     <w:multiLevelType w:val="multilevel"/>
     <w:tmpl w:val="A8ECD766"/>
@@ -5448,7 +8689,7 @@
       </w:rPr>
     </w:lvl>
   </w:abstractNum>
-  <w:abstractNum w:abstractNumId="5" w15:restartNumberingAfterBreak="0">
+  <w:abstractNum w:abstractNumId="15" w15:restartNumberingAfterBreak="0">
     <w:nsid w:val="5E9D06C8"/>
     <w:multiLevelType w:val="multilevel"/>
     <w:tmpl w:val="CA0E1E6C"/>
@@ -5597,7 +8838,305 @@
       </w:rPr>
     </w:lvl>
   </w:abstractNum>
-  <w:abstractNum w:abstractNumId="6" w15:restartNumberingAfterBreak="0">
+  <w:abstractNum w:abstractNumId="16" w15:restartNumberingAfterBreak="0">
+    <w:nsid w:val="67BE38CF"/>
+    <w:multiLevelType w:val="multilevel"/>
+    <w:tmpl w:val="4B36BBA0"/>
+    <w:lvl w:ilvl="0">
+      <w:start w:val="1"/>
+      <w:numFmt w:val="bullet"/>
+      <w:lvlText w:val=""/>
+      <w:lvlJc w:val="left"/>
+      <w:pPr>
+        <w:tabs>
+          <w:tab w:val="num" w:pos="720"/>
+        </w:tabs>
+        <w:ind w:left="720" w:hanging="360"/>
+      </w:pPr>
+      <w:rPr>
+        <w:rFonts w:ascii="Symbol" w:hAnsi="Symbol" w:hint="default"/>
+        <w:sz w:val="20"/>
+      </w:rPr>
+    </w:lvl>
+    <w:lvl w:ilvl="1" w:tentative="1">
+      <w:start w:val="1"/>
+      <w:numFmt w:val="bullet"/>
+      <w:lvlText w:val="o"/>
+      <w:lvlJc w:val="left"/>
+      <w:pPr>
+        <w:tabs>
+          <w:tab w:val="num" w:pos="1440"/>
+        </w:tabs>
+        <w:ind w:left="1440" w:hanging="360"/>
+      </w:pPr>
+      <w:rPr>
+        <w:rFonts w:ascii="Courier New" w:hAnsi="Courier New" w:hint="default"/>
+        <w:sz w:val="20"/>
+      </w:rPr>
+    </w:lvl>
+    <w:lvl w:ilvl="2" w:tentative="1">
+      <w:start w:val="1"/>
+      <w:numFmt w:val="bullet"/>
+      <w:lvlText w:val=""/>
+      <w:lvlJc w:val="left"/>
+      <w:pPr>
+        <w:tabs>
+          <w:tab w:val="num" w:pos="2160"/>
+        </w:tabs>
+        <w:ind w:left="2160" w:hanging="360"/>
+      </w:pPr>
+      <w:rPr>
+        <w:rFonts w:ascii="Wingdings" w:hAnsi="Wingdings" w:hint="default"/>
+        <w:sz w:val="20"/>
+      </w:rPr>
+    </w:lvl>
+    <w:lvl w:ilvl="3" w:tentative="1">
+      <w:start w:val="1"/>
+      <w:numFmt w:val="bullet"/>
+      <w:lvlText w:val=""/>
+      <w:lvlJc w:val="left"/>
+      <w:pPr>
+        <w:tabs>
+          <w:tab w:val="num" w:pos="2880"/>
+        </w:tabs>
+        <w:ind w:left="2880" w:hanging="360"/>
+      </w:pPr>
+      <w:rPr>
+        <w:rFonts w:ascii="Wingdings" w:hAnsi="Wingdings" w:hint="default"/>
+        <w:sz w:val="20"/>
+      </w:rPr>
+    </w:lvl>
+    <w:lvl w:ilvl="4" w:tentative="1">
+      <w:start w:val="1"/>
+      <w:numFmt w:val="bullet"/>
+      <w:lvlText w:val=""/>
+      <w:lvlJc w:val="left"/>
+      <w:pPr>
+        <w:tabs>
+          <w:tab w:val="num" w:pos="3600"/>
+        </w:tabs>
+        <w:ind w:left="3600" w:hanging="360"/>
+      </w:pPr>
+      <w:rPr>
+        <w:rFonts w:ascii="Wingdings" w:hAnsi="Wingdings" w:hint="default"/>
+        <w:sz w:val="20"/>
+      </w:rPr>
+    </w:lvl>
+    <w:lvl w:ilvl="5" w:tentative="1">
+      <w:start w:val="1"/>
+      <w:numFmt w:val="bullet"/>
+      <w:lvlText w:val=""/>
+      <w:lvlJc w:val="left"/>
+      <w:pPr>
+        <w:tabs>
+          <w:tab w:val="num" w:pos="4320"/>
+        </w:tabs>
+        <w:ind w:left="4320" w:hanging="360"/>
+      </w:pPr>
+      <w:rPr>
+        <w:rFonts w:ascii="Wingdings" w:hAnsi="Wingdings" w:hint="default"/>
+        <w:sz w:val="20"/>
+      </w:rPr>
+    </w:lvl>
+    <w:lvl w:ilvl="6" w:tentative="1">
+      <w:start w:val="1"/>
+      <w:numFmt w:val="bullet"/>
+      <w:lvlText w:val=""/>
+      <w:lvlJc w:val="left"/>
+      <w:pPr>
+        <w:tabs>
+          <w:tab w:val="num" w:pos="5040"/>
+        </w:tabs>
+        <w:ind w:left="5040" w:hanging="360"/>
+      </w:pPr>
+      <w:rPr>
+        <w:rFonts w:ascii="Wingdings" w:hAnsi="Wingdings" w:hint="default"/>
+        <w:sz w:val="20"/>
+      </w:rPr>
+    </w:lvl>
+    <w:lvl w:ilvl="7" w:tentative="1">
+      <w:start w:val="1"/>
+      <w:numFmt w:val="bullet"/>
+      <w:lvlText w:val=""/>
+      <w:lvlJc w:val="left"/>
+      <w:pPr>
+        <w:tabs>
+          <w:tab w:val="num" w:pos="5760"/>
+        </w:tabs>
+        <w:ind w:left="5760" w:hanging="360"/>
+      </w:pPr>
+      <w:rPr>
+        <w:rFonts w:ascii="Wingdings" w:hAnsi="Wingdings" w:hint="default"/>
+        <w:sz w:val="20"/>
+      </w:rPr>
+    </w:lvl>
+    <w:lvl w:ilvl="8" w:tentative="1">
+      <w:start w:val="1"/>
+      <w:numFmt w:val="bullet"/>
+      <w:lvlText w:val=""/>
+      <w:lvlJc w:val="left"/>
+      <w:pPr>
+        <w:tabs>
+          <w:tab w:val="num" w:pos="6480"/>
+        </w:tabs>
+        <w:ind w:left="6480" w:hanging="360"/>
+      </w:pPr>
+      <w:rPr>
+        <w:rFonts w:ascii="Wingdings" w:hAnsi="Wingdings" w:hint="default"/>
+        <w:sz w:val="20"/>
+      </w:rPr>
+    </w:lvl>
+  </w:abstractNum>
+  <w:abstractNum w:abstractNumId="17" w15:restartNumberingAfterBreak="0">
+    <w:nsid w:val="6B654D37"/>
+    <w:multiLevelType w:val="multilevel"/>
+    <w:tmpl w:val="F4C27668"/>
+    <w:lvl w:ilvl="0">
+      <w:start w:val="1"/>
+      <w:numFmt w:val="bullet"/>
+      <w:lvlText w:val=""/>
+      <w:lvlJc w:val="left"/>
+      <w:pPr>
+        <w:tabs>
+          <w:tab w:val="num" w:pos="720"/>
+        </w:tabs>
+        <w:ind w:left="720" w:hanging="360"/>
+      </w:pPr>
+      <w:rPr>
+        <w:rFonts w:ascii="Symbol" w:hAnsi="Symbol" w:hint="default"/>
+        <w:sz w:val="20"/>
+      </w:rPr>
+    </w:lvl>
+    <w:lvl w:ilvl="1" w:tentative="1">
+      <w:start w:val="1"/>
+      <w:numFmt w:val="bullet"/>
+      <w:lvlText w:val="o"/>
+      <w:lvlJc w:val="left"/>
+      <w:pPr>
+        <w:tabs>
+          <w:tab w:val="num" w:pos="1440"/>
+        </w:tabs>
+        <w:ind w:left="1440" w:hanging="360"/>
+      </w:pPr>
+      <w:rPr>
+        <w:rFonts w:ascii="Courier New" w:hAnsi="Courier New" w:hint="default"/>
+        <w:sz w:val="20"/>
+      </w:rPr>
+    </w:lvl>
+    <w:lvl w:ilvl="2" w:tentative="1">
+      <w:start w:val="1"/>
+      <w:numFmt w:val="bullet"/>
+      <w:lvlText w:val=""/>
+      <w:lvlJc w:val="left"/>
+      <w:pPr>
+        <w:tabs>
+          <w:tab w:val="num" w:pos="2160"/>
+        </w:tabs>
+        <w:ind w:left="2160" w:hanging="360"/>
+      </w:pPr>
+      <w:rPr>
+        <w:rFonts w:ascii="Wingdings" w:hAnsi="Wingdings" w:hint="default"/>
+        <w:sz w:val="20"/>
+      </w:rPr>
+    </w:lvl>
+    <w:lvl w:ilvl="3" w:tentative="1">
+      <w:start w:val="1"/>
+      <w:numFmt w:val="bullet"/>
+      <w:lvlText w:val=""/>
+      <w:lvlJc w:val="left"/>
+      <w:pPr>
+        <w:tabs>
+          <w:tab w:val="num" w:pos="2880"/>
+        </w:tabs>
+        <w:ind w:left="2880" w:hanging="360"/>
+      </w:pPr>
+      <w:rPr>
+        <w:rFonts w:ascii="Wingdings" w:hAnsi="Wingdings" w:hint="default"/>
+        <w:sz w:val="20"/>
+      </w:rPr>
+    </w:lvl>
+    <w:lvl w:ilvl="4" w:tentative="1">
+      <w:start w:val="1"/>
+      <w:numFmt w:val="bullet"/>
+      <w:lvlText w:val=""/>
+      <w:lvlJc w:val="left"/>
+      <w:pPr>
+        <w:tabs>
+          <w:tab w:val="num" w:pos="3600"/>
+        </w:tabs>
+        <w:ind w:left="3600" w:hanging="360"/>
+      </w:pPr>
+      <w:rPr>
+        <w:rFonts w:ascii="Wingdings" w:hAnsi="Wingdings" w:hint="default"/>
+        <w:sz w:val="20"/>
+      </w:rPr>
+    </w:lvl>
+    <w:lvl w:ilvl="5" w:tentative="1">
+      <w:start w:val="1"/>
+      <w:numFmt w:val="bullet"/>
+      <w:lvlText w:val=""/>
+      <w:lvlJc w:val="left"/>
+      <w:pPr>
+        <w:tabs>
+          <w:tab w:val="num" w:pos="4320"/>
+        </w:tabs>
+        <w:ind w:left="4320" w:hanging="360"/>
+      </w:pPr>
+      <w:rPr>
+        <w:rFonts w:ascii="Wingdings" w:hAnsi="Wingdings" w:hint="default"/>
+        <w:sz w:val="20"/>
+      </w:rPr>
+    </w:lvl>
+    <w:lvl w:ilvl="6" w:tentative="1">
+      <w:start w:val="1"/>
+      <w:numFmt w:val="bullet"/>
+      <w:lvlText w:val=""/>
+      <w:lvlJc w:val="left"/>
+      <w:pPr>
+        <w:tabs>
+          <w:tab w:val="num" w:pos="5040"/>
+        </w:tabs>
+        <w:ind w:left="5040" w:hanging="360"/>
+      </w:pPr>
+      <w:rPr>
+        <w:rFonts w:ascii="Wingdings" w:hAnsi="Wingdings" w:hint="default"/>
+        <w:sz w:val="20"/>
+      </w:rPr>
+    </w:lvl>
+    <w:lvl w:ilvl="7" w:tentative="1">
+      <w:start w:val="1"/>
+      <w:numFmt w:val="bullet"/>
+      <w:lvlText w:val=""/>
+      <w:lvlJc w:val="left"/>
+      <w:pPr>
+        <w:tabs>
+          <w:tab w:val="num" w:pos="5760"/>
+        </w:tabs>
+        <w:ind w:left="5760" w:hanging="360"/>
+      </w:pPr>
+      <w:rPr>
+        <w:rFonts w:ascii="Wingdings" w:hAnsi="Wingdings" w:hint="default"/>
+        <w:sz w:val="20"/>
+      </w:rPr>
+    </w:lvl>
+    <w:lvl w:ilvl="8" w:tentative="1">
+      <w:start w:val="1"/>
+      <w:numFmt w:val="bullet"/>
+      <w:lvlText w:val=""/>
+      <w:lvlJc w:val="left"/>
+      <w:pPr>
+        <w:tabs>
+          <w:tab w:val="num" w:pos="6480"/>
+        </w:tabs>
+        <w:ind w:left="6480" w:hanging="360"/>
+      </w:pPr>
+      <w:rPr>
+        <w:rFonts w:ascii="Wingdings" w:hAnsi="Wingdings" w:hint="default"/>
+        <w:sz w:val="20"/>
+      </w:rPr>
+    </w:lvl>
+  </w:abstractNum>
+  <w:abstractNum w:abstractNumId="18" w15:restartNumberingAfterBreak="0">
     <w:nsid w:val="6CD32299"/>
     <w:multiLevelType w:val="multilevel"/>
     <w:tmpl w:val="0526E402"/>
@@ -5747,25 +9286,61 @@
     </w:lvl>
   </w:abstractNum>
   <w:num w:numId="1" w16cid:durableId="925311337">
-    <w:abstractNumId w:val="5"/>
+    <w:abstractNumId w:val="15"/>
   </w:num>
   <w:num w:numId="2" w16cid:durableId="1197618985">
     <w:abstractNumId w:val="0"/>
   </w:num>
   <w:num w:numId="3" w16cid:durableId="100078552">
+    <w:abstractNumId w:val="14"/>
+  </w:num>
+  <w:num w:numId="4" w16cid:durableId="1326514990">
+    <w:abstractNumId w:val="18"/>
+  </w:num>
+  <w:num w:numId="5" w16cid:durableId="468136604">
+    <w:abstractNumId w:val="2"/>
+  </w:num>
+  <w:num w:numId="6" w16cid:durableId="1250431639">
+    <w:abstractNumId w:val="9"/>
+  </w:num>
+  <w:num w:numId="7" w16cid:durableId="1458990892">
+    <w:abstractNumId w:val="13"/>
+  </w:num>
+  <w:num w:numId="8" w16cid:durableId="841747041">
+    <w:abstractNumId w:val="16"/>
+  </w:num>
+  <w:num w:numId="9" w16cid:durableId="1635209493">
+    <w:abstractNumId w:val="10"/>
+  </w:num>
+  <w:num w:numId="10" w16cid:durableId="1889223933">
+    <w:abstractNumId w:val="12"/>
+  </w:num>
+  <w:num w:numId="11" w16cid:durableId="1991861206">
+    <w:abstractNumId w:val="8"/>
+  </w:num>
+  <w:num w:numId="12" w16cid:durableId="1589843793">
+    <w:abstractNumId w:val="6"/>
+  </w:num>
+  <w:num w:numId="13" w16cid:durableId="851257978">
+    <w:abstractNumId w:val="3"/>
+  </w:num>
+  <w:num w:numId="14" w16cid:durableId="1693339335">
     <w:abstractNumId w:val="4"/>
   </w:num>
-  <w:num w:numId="4" w16cid:durableId="1326514990">
-    <w:abstractNumId w:val="6"/>
+  <w:num w:numId="15" w16cid:durableId="1879850530">
+    <w:abstractNumId w:val="17"/>
   </w:num>
-  <w:num w:numId="5" w16cid:durableId="468136604">
+  <w:num w:numId="16" w16cid:durableId="1988313210">
+    <w:abstractNumId w:val="11"/>
+  </w:num>
+  <w:num w:numId="17" w16cid:durableId="1687439214">
+    <w:abstractNumId w:val="5"/>
+  </w:num>
+  <w:num w:numId="18" w16cid:durableId="828524156">
     <w:abstractNumId w:val="1"/>
   </w:num>
-  <w:num w:numId="6" w16cid:durableId="1250431639">
-    <w:abstractNumId w:val="2"/>
-  </w:num>
-  <w:num w:numId="7" w16cid:durableId="1458990892">
-    <w:abstractNumId w:val="3"/>
+  <w:num w:numId="19" w16cid:durableId="901793087">
+    <w:abstractNumId w:val="7"/>
   </w:num>
 </w:numbering>
 </file>

</xml_diff>